<commit_message>
F4: alinea notebook, informe y presentación (carga desde GitHub, trazabilidad de cifras, bibliografía y precisiones de redacción)
</commit_message>
<xml_diff>
--- a/MCDI503/docs/mcdi503_f4_sumativo_grupo5.docx
+++ b/MCDI503/docs/mcdi503_f4_sumativo_grupo5.docx
@@ -263,6 +263,7 @@
             <w:pPr>
               <w:spacing w:after="0" w:line="240" w:lineRule="auto"/>
             </w:pPr>
+            <w:proofErr w:type="spellStart"/>
             <w:r>
               <w:rPr>
                 <w:b/>
@@ -270,6 +271,7 @@
               </w:rPr>
               <w:t>Integrantes</w:t>
             </w:r>
+            <w:proofErr w:type="spellEnd"/>
           </w:p>
         </w:tc>
         <w:tc>
@@ -375,14 +377,14 @@
                 <w:sz w:val="16"/>
                 <w:lang w:val="es-CL"/>
               </w:rPr>
-              <w:t>titanic_prepared.csv</w:t>
+              <w:t>Titanic-Dataset.csv</w:t>
             </w:r>
             <w:r>
               <w:rPr>
                 <w:sz w:val="19"/>
                 <w:lang w:val="es-CL"/>
               </w:rPr>
-              <w:t xml:space="preserve"> (Fases 2-3): 891 pasajeros, 32 variables; fuente original Titanic-Dataset.csv (</w:t>
+              <w:t xml:space="preserve"> (</w:t>
             </w:r>
             <w:proofErr w:type="spellStart"/>
             <w:r>
@@ -398,7 +400,7 @@
                 <w:sz w:val="19"/>
                 <w:lang w:val="es-CL"/>
               </w:rPr>
-              <w:t xml:space="preserve">) integrada con </w:t>
+              <w:t xml:space="preserve">) integrado con </w:t>
             </w:r>
             <w:proofErr w:type="spellStart"/>
             <w:r>
@@ -414,7 +416,7 @@
                 <w:sz w:val="19"/>
                 <w:lang w:val="es-CL"/>
               </w:rPr>
-              <w:t>-data</w:t>
+              <w:t>-data, leídos desde sus repositorios públicos en GitHub; preparación de las Fases 2-3 reproducida en el notebook (891 × 32)</w:t>
             </w:r>
           </w:p>
         </w:tc>
@@ -516,7 +518,21 @@
               <w:rPr>
                 <w:sz w:val="19"/>
               </w:rPr>
-              <w:t>20 de septiembre de 2026</w:t>
+              <w:t xml:space="preserve">20 de </w:t>
+            </w:r>
+            <w:proofErr w:type="spellStart"/>
+            <w:r>
+              <w:rPr>
+                <w:sz w:val="19"/>
+              </w:rPr>
+              <w:t>septiembre</w:t>
+            </w:r>
+            <w:proofErr w:type="spellEnd"/>
+            <w:r>
+              <w:rPr>
+                <w:sz w:val="19"/>
+              </w:rPr>
+              <w:t xml:space="preserve"> de 2026</w:t>
             </w:r>
           </w:p>
         </w:tc>
@@ -554,21 +570,7 @@
         <w:rPr>
           <w:lang w:val="es-CL"/>
         </w:rPr>
-        <w:t xml:space="preserve"> este informe sintetiza el cierre técnico del proyecto, cuya evidencia principal es el notebook de la Fase 4 (referenciado como «NB §» seguido del número de sección). A partir del </w:t>
-      </w:r>
-      <w:proofErr w:type="spellStart"/>
-      <w:r>
-        <w:rPr>
-          <w:lang w:val="es-CL"/>
-        </w:rPr>
-        <w:t>dataset</w:t>
-      </w:r>
-      <w:proofErr w:type="spellEnd"/>
-      <w:r>
-        <w:rPr>
-          <w:lang w:val="es-CL"/>
-        </w:rPr>
-        <w:t xml:space="preserve"> ya depurado en las Fases 2-3, el pipeline entrega un conjunto de características codificado, escalado y justificado para predecir la supervivencia de los pasajeros del RMS </w:t>
+        <w:t xml:space="preserve"> cierre técnico del proyecto, cuya evidencia principal es el notebook de la Fase 4 (citado como «NB §»). Sobre la preparación de las Fases 2-3, el pipeline entrega un conjunto de características codificado, escalado y justificado para predecir la supervivencia de los pasajeros del RMS </w:t>
       </w:r>
       <w:proofErr w:type="spellStart"/>
       <w:r>
@@ -647,7 +649,7 @@
         <w:rPr>
           <w:lang w:val="es-CL"/>
         </w:rPr>
-        <w:t xml:space="preserve"> (1912) es un caso clásico de clasificación binaria: la supervivencia se asocia a atributos del pasajero como sexo, clase, edad y tamaño del grupo de viaje. Se mantuvo el </w:t>
+        <w:t xml:space="preserve"> (1912) es un caso clásico de clasificación binaria: la supervivencia se asocia a sexo, clase, edad y tamaño del grupo de viaje. Se mantuvo el </w:t>
       </w:r>
       <w:proofErr w:type="spellStart"/>
       <w:r>
@@ -661,7 +663,7 @@
         <w:rPr>
           <w:lang w:val="es-CL"/>
         </w:rPr>
-        <w:t xml:space="preserve"> de las fases anteriores por ser la opción más completa para evidenciar transformaciones, variables derivadas, codificación de categóricas y selección de características (</w:t>
+        <w:t xml:space="preserve"> de las fases anteriores, la opción más completa para evidenciar transformaciones, variables derivadas, codificación y selección de características (</w:t>
       </w:r>
       <w:proofErr w:type="spellStart"/>
       <w:r>
@@ -710,7 +712,7 @@
         <w:rPr>
           <w:lang w:val="es-CL"/>
         </w:rPr>
-        <w:t xml:space="preserve"> listo para modelar sin entrenar ningún modelo en esta fase (RA4).</w:t>
+        <w:t xml:space="preserve"> listo para modelar sin entrenar ni evaluar un modelo predictivo en esta fase (RA4).</w:t>
       </w:r>
     </w:p>
     <w:p>
@@ -915,21 +917,7 @@
         <w:rPr>
           <w:lang w:val="es-CL"/>
         </w:rPr>
-        <w:t xml:space="preserve"> sobre la supervivencia difiere por sexo. Este pipeline parte de ese </w:t>
-      </w:r>
-      <w:proofErr w:type="spellStart"/>
-      <w:r>
-        <w:rPr>
-          <w:lang w:val="es-CL"/>
-        </w:rPr>
-        <w:t>dataset</w:t>
-      </w:r>
-      <w:proofErr w:type="spellEnd"/>
-      <w:r>
-        <w:rPr>
-          <w:lang w:val="es-CL"/>
-        </w:rPr>
-        <w:t xml:space="preserve"> (NB §III), sin volver al crudo.</w:t>
+        <w:t xml:space="preserve"> sobre la supervivencia difiere por sexo. El notebook lee ambas fuentes desde sus repositorios públicos, reproduce en memoria la preparación de las Fases 2-3 (NB §II.2) y construye el pipeline sobre ese resultado (NB §III).</w:t>
       </w:r>
     </w:p>
     <w:p>
@@ -1126,7 +1114,6 @@
       </w:tblGrid>
       <w:tr>
         <w:trPr>
-          <w:cantSplit/>
           <w:tblHeader/>
           <w:jc w:val="center"/>
         </w:trPr>
@@ -1158,6 +1145,7 @@
             <w:pPr>
               <w:spacing w:after="0" w:line="240" w:lineRule="auto"/>
             </w:pPr>
+            <w:proofErr w:type="spellStart"/>
             <w:r>
               <w:rPr>
                 <w:b/>
@@ -1166,6 +1154,7 @@
               </w:rPr>
               <w:t>Operación</w:t>
             </w:r>
+            <w:proofErr w:type="spellEnd"/>
           </w:p>
         </w:tc>
         <w:tc>
@@ -1234,7 +1223,25 @@
                 <w:color w:val="FFFFFF"/>
                 <w:sz w:val="18"/>
               </w:rPr>
-              <w:t xml:space="preserve"> los </w:t>
+              <w:t xml:space="preserve"> </w:t>
+            </w:r>
+            <w:proofErr w:type="spellStart"/>
+            <w:r>
+              <w:rPr>
+                <w:b/>
+                <w:color w:val="FFFFFF"/>
+                <w:sz w:val="18"/>
+              </w:rPr>
+              <w:t>los</w:t>
+            </w:r>
+            <w:proofErr w:type="spellEnd"/>
+            <w:r>
+              <w:rPr>
+                <w:b/>
+                <w:color w:val="FFFFFF"/>
+                <w:sz w:val="18"/>
+              </w:rPr>
+              <w:t xml:space="preserve"> </w:t>
             </w:r>
             <w:proofErr w:type="spellStart"/>
             <w:r>
@@ -1251,7 +1258,6 @@
       </w:tr>
       <w:tr>
         <w:trPr>
-          <w:cantSplit/>
           <w:jc w:val="center"/>
         </w:trPr>
         <w:tc>
@@ -1262,6 +1268,7 @@
             <w:pPr>
               <w:spacing w:after="0" w:line="240" w:lineRule="auto"/>
             </w:pPr>
+            <w:proofErr w:type="spellStart"/>
             <w:r>
               <w:rPr>
                 <w:rFonts w:ascii="Consolas" w:eastAsia="Consolas" w:hAnsi="Consolas"/>
@@ -1269,12 +1276,14 @@
               </w:rPr>
               <w:t>Fare_per_person_log</w:t>
             </w:r>
+            <w:proofErr w:type="spellEnd"/>
             <w:r>
               <w:rPr>
                 <w:sz w:val="18"/>
               </w:rPr>
               <w:t xml:space="preserve">, </w:t>
             </w:r>
+            <w:proofErr w:type="spellStart"/>
             <w:r>
               <w:rPr>
                 <w:rFonts w:ascii="Consolas" w:eastAsia="Consolas" w:hAnsi="Consolas"/>
@@ -1282,12 +1291,14 @@
               </w:rPr>
               <w:t>FamilySize</w:t>
             </w:r>
+            <w:proofErr w:type="spellEnd"/>
             <w:r>
               <w:rPr>
                 <w:sz w:val="18"/>
               </w:rPr>
               <w:t xml:space="preserve">, </w:t>
             </w:r>
+            <w:proofErr w:type="spellStart"/>
             <w:r>
               <w:rPr>
                 <w:rFonts w:ascii="Consolas" w:eastAsia="Consolas" w:hAnsi="Consolas"/>
@@ -1295,6 +1306,7 @@
               </w:rPr>
               <w:t>TicketGroupSize</w:t>
             </w:r>
+            <w:proofErr w:type="spellEnd"/>
           </w:p>
         </w:tc>
         <w:tc>
@@ -1464,7 +1476,6 @@
       </w:tr>
       <w:tr>
         <w:trPr>
-          <w:cantSplit/>
           <w:jc w:val="center"/>
         </w:trPr>
         <w:tc>
@@ -1475,6 +1486,7 @@
             <w:pPr>
               <w:spacing w:after="0" w:line="240" w:lineRule="auto"/>
             </w:pPr>
+            <w:proofErr w:type="spellStart"/>
             <w:r>
               <w:rPr>
                 <w:rFonts w:ascii="Consolas" w:eastAsia="Consolas" w:hAnsi="Consolas"/>
@@ -1482,6 +1494,7 @@
               </w:rPr>
               <w:t>Fare_per_person</w:t>
             </w:r>
+            <w:proofErr w:type="spellEnd"/>
           </w:p>
         </w:tc>
         <w:tc>
@@ -1548,7 +1561,6 @@
       </w:tr>
       <w:tr>
         <w:trPr>
-          <w:cantSplit/>
           <w:jc w:val="center"/>
         </w:trPr>
         <w:tc>
@@ -1559,6 +1571,7 @@
             <w:pPr>
               <w:spacing w:after="0" w:line="240" w:lineRule="auto"/>
             </w:pPr>
+            <w:proofErr w:type="spellStart"/>
             <w:r>
               <w:rPr>
                 <w:rFonts w:ascii="Consolas" w:eastAsia="Consolas" w:hAnsi="Consolas"/>
@@ -1566,12 +1579,14 @@
               </w:rPr>
               <w:t>Title_agrupado</w:t>
             </w:r>
+            <w:proofErr w:type="spellEnd"/>
             <w:r>
               <w:rPr>
                 <w:sz w:val="18"/>
               </w:rPr>
               <w:t xml:space="preserve">, </w:t>
             </w:r>
+            <w:proofErr w:type="spellStart"/>
             <w:r>
               <w:rPr>
                 <w:rFonts w:ascii="Consolas" w:eastAsia="Consolas" w:hAnsi="Consolas"/>
@@ -1579,12 +1594,14 @@
               </w:rPr>
               <w:t>Sex_Pclass</w:t>
             </w:r>
+            <w:proofErr w:type="spellEnd"/>
             <w:r>
               <w:rPr>
                 <w:sz w:val="18"/>
               </w:rPr>
               <w:t xml:space="preserve">, </w:t>
             </w:r>
+            <w:proofErr w:type="spellStart"/>
             <w:r>
               <w:rPr>
                 <w:rFonts w:ascii="Consolas" w:eastAsia="Consolas" w:hAnsi="Consolas"/>
@@ -1592,12 +1609,14 @@
               </w:rPr>
               <w:t>AgeGroup</w:t>
             </w:r>
+            <w:proofErr w:type="spellEnd"/>
             <w:r>
               <w:rPr>
                 <w:sz w:val="18"/>
               </w:rPr>
               <w:t xml:space="preserve">, </w:t>
             </w:r>
+            <w:proofErr w:type="spellStart"/>
             <w:r>
               <w:rPr>
                 <w:rFonts w:ascii="Consolas" w:eastAsia="Consolas" w:hAnsi="Consolas"/>
@@ -1605,12 +1624,14 @@
               </w:rPr>
               <w:t>Embarked_clean</w:t>
             </w:r>
+            <w:proofErr w:type="spellEnd"/>
             <w:r>
               <w:rPr>
                 <w:sz w:val="18"/>
               </w:rPr>
               <w:t xml:space="preserve">, </w:t>
             </w:r>
+            <w:proofErr w:type="spellStart"/>
             <w:r>
               <w:rPr>
                 <w:rFonts w:ascii="Consolas" w:eastAsia="Consolas" w:hAnsi="Consolas"/>
@@ -1618,6 +1639,7 @@
               </w:rPr>
               <w:t>Deck_combinado</w:t>
             </w:r>
+            <w:proofErr w:type="spellEnd"/>
           </w:p>
         </w:tc>
         <w:tc>
@@ -1716,122 +1738,6 @@
           </w:p>
         </w:tc>
       </w:tr>
-      <w:tr>
-        <w:trPr>
-          <w:cantSplit/>
-          <w:jc w:val="center"/>
-        </w:trPr>
-        <w:tc>
-          <w:tcPr>
-            <w:tcW w:w="2232" w:type="dxa"/>
-          </w:tcPr>
-          <w:p>
-            <w:pPr>
-              <w:spacing w:after="0" w:line="240" w:lineRule="auto"/>
-            </w:pPr>
-            <w:r>
-              <w:rPr>
-                <w:rFonts w:ascii="Consolas" w:eastAsia="Consolas" w:hAnsi="Consolas"/>
-                <w:sz w:val="15"/>
-              </w:rPr>
-              <w:t>Pclass</w:t>
-            </w:r>
-          </w:p>
-        </w:tc>
-        <w:tc>
-          <w:tcPr>
-            <w:tcW w:w="1512" w:type="dxa"/>
-          </w:tcPr>
-          <w:p>
-            <w:pPr>
-              <w:spacing w:after="0" w:line="240" w:lineRule="auto"/>
-              <w:rPr>
-                <w:lang w:val="es-CL"/>
-              </w:rPr>
-            </w:pPr>
-            <w:r>
-              <w:rPr>
-                <w:sz w:val="18"/>
-                <w:lang w:val="es-CL"/>
-              </w:rPr>
-              <w:t>Se retira del set final</w:t>
-            </w:r>
-          </w:p>
-        </w:tc>
-        <w:tc>
-          <w:tcPr>
-            <w:tcW w:w="3672" w:type="dxa"/>
-          </w:tcPr>
-          <w:p>
-            <w:pPr>
-              <w:spacing w:after="0" w:line="240" w:lineRule="auto"/>
-              <w:rPr>
-                <w:lang w:val="es-CL"/>
-              </w:rPr>
-            </w:pPr>
-            <w:r>
-              <w:rPr>
-                <w:sz w:val="18"/>
-                <w:lang w:val="es-CL"/>
-              </w:rPr>
-              <w:t xml:space="preserve">Combinación lineal exacta de las </w:t>
-            </w:r>
-            <w:proofErr w:type="spellStart"/>
-            <w:r>
-              <w:rPr>
-                <w:sz w:val="18"/>
-                <w:lang w:val="es-CL"/>
-              </w:rPr>
-              <w:t>dummies</w:t>
-            </w:r>
-            <w:proofErr w:type="spellEnd"/>
-            <w:r>
-              <w:rPr>
-                <w:sz w:val="18"/>
-                <w:lang w:val="es-CL"/>
-              </w:rPr>
-              <w:t xml:space="preserve"> de </w:t>
-            </w:r>
-            <w:proofErr w:type="spellStart"/>
-            <w:r>
-              <w:rPr>
-                <w:rFonts w:ascii="Consolas" w:eastAsia="Consolas" w:hAnsi="Consolas"/>
-                <w:sz w:val="15"/>
-                <w:lang w:val="es-CL"/>
-              </w:rPr>
-              <w:t>Sex_Pclass</w:t>
-            </w:r>
-            <w:proofErr w:type="spellEnd"/>
-            <w:r>
-              <w:rPr>
-                <w:sz w:val="18"/>
-                <w:lang w:val="es-CL"/>
-              </w:rPr>
-              <w:t xml:space="preserve"> (NB §VI.2).</w:t>
-            </w:r>
-          </w:p>
-        </w:tc>
-        <w:tc>
-          <w:tcPr>
-            <w:tcW w:w="1944" w:type="dxa"/>
-          </w:tcPr>
-          <w:p>
-            <w:pPr>
-              <w:spacing w:after="0" w:line="240" w:lineRule="auto"/>
-              <w:rPr>
-                <w:lang w:val="es-CL"/>
-              </w:rPr>
-            </w:pPr>
-            <w:r>
-              <w:rPr>
-                <w:sz w:val="18"/>
-                <w:lang w:val="es-CL"/>
-              </w:rPr>
-              <w:t>Matriz de rango completo (28 de 28 columnas).</w:t>
-            </w:r>
-          </w:p>
-        </w:tc>
-      </w:tr>
     </w:tbl>
     <w:p>
       <w:pPr>
@@ -1869,9 +1775,9 @@
           <w:noProof/>
         </w:rPr>
         <w:drawing>
-          <wp:inline distT="0" distB="0" distL="0" distR="0" wp14:anchorId="22EBA666" wp14:editId="455B4C67">
-            <wp:extent cx="3931920" cy="1586776"/>
-            <wp:effectExtent l="0" t="0" r="0" b="0"/>
+          <wp:inline distT="0" distB="0" distL="0" distR="0" wp14:anchorId="22EBA666" wp14:editId="505B201E">
+            <wp:extent cx="6010718" cy="2425700"/>
+            <wp:effectExtent l="0" t="0" r="9525" b="0"/>
             <wp:docPr id="2" name="Picture 2"/>
             <wp:cNvGraphicFramePr>
               <a:graphicFrameLocks xmlns:a="http://schemas.openxmlformats.org/drawingml/2006/main" noChangeAspect="1"/>
@@ -1892,7 +1798,7 @@
                   <pic:spPr>
                     <a:xfrm>
                       <a:off x="0" y="0"/>
-                      <a:ext cx="3931920" cy="1586776"/>
+                      <a:ext cx="6032409" cy="2434454"/>
                     </a:xfrm>
                     <a:prstGeom prst="rect">
                       <a:avLst/>
@@ -2080,42 +1986,6 @@
       <w:pPr>
         <w:spacing w:after="40"/>
         <w:jc w:val="both"/>
-        <w:rPr>
-          <w:lang w:val="es-CL"/>
-        </w:rPr>
-      </w:pPr>
-    </w:p>
-    <w:p>
-      <w:pPr>
-        <w:spacing w:after="40"/>
-        <w:jc w:val="both"/>
-        <w:rPr>
-          <w:lang w:val="es-CL"/>
-        </w:rPr>
-      </w:pPr>
-    </w:p>
-    <w:p>
-      <w:pPr>
-        <w:spacing w:after="40"/>
-        <w:jc w:val="both"/>
-        <w:rPr>
-          <w:lang w:val="es-CL"/>
-        </w:rPr>
-      </w:pPr>
-    </w:p>
-    <w:p>
-      <w:pPr>
-        <w:keepNext/>
-        <w:spacing w:before="80" w:after="40" w:line="240" w:lineRule="auto"/>
-        <w:rPr>
-          <w:lang w:val="es-CL"/>
-        </w:rPr>
-      </w:pPr>
-    </w:p>
-    <w:p>
-      <w:pPr>
-        <w:keepNext/>
-        <w:spacing w:before="80" w:after="40" w:line="240" w:lineRule="auto"/>
         <w:rPr>
           <w:lang w:val="es-CL"/>
         </w:rPr>
@@ -2149,7 +2019,6 @@
       </w:tblGrid>
       <w:tr>
         <w:trPr>
-          <w:cantSplit/>
           <w:tblHeader/>
           <w:jc w:val="center"/>
         </w:trPr>
@@ -2187,8 +2056,18 @@
                 <w:color w:val="FFFFFF"/>
                 <w:sz w:val="18"/>
               </w:rPr>
-              <w:t>Origen y regla</w:t>
-            </w:r>
+              <w:t xml:space="preserve">Origen y </w:t>
+            </w:r>
+            <w:proofErr w:type="spellStart"/>
+            <w:r>
+              <w:rPr>
+                <w:b/>
+                <w:color w:val="FFFFFF"/>
+                <w:sz w:val="18"/>
+              </w:rPr>
+              <w:t>regla</w:t>
+            </w:r>
+            <w:proofErr w:type="spellEnd"/>
           </w:p>
         </w:tc>
         <w:tc>
@@ -2217,7 +2096,6 @@
       </w:tr>
       <w:tr>
         <w:trPr>
-          <w:cantSplit/>
           <w:jc w:val="center"/>
         </w:trPr>
         <w:tc>
@@ -2295,6 +2173,7 @@
               </w:rPr>
               <w:t xml:space="preserve">. </w:t>
             </w:r>
+            <w:proofErr w:type="spellStart"/>
             <w:r>
               <w:rPr>
                 <w:rFonts w:ascii="Consolas" w:eastAsia="Consolas" w:hAnsi="Consolas"/>
@@ -2302,11 +2181,40 @@
               </w:rPr>
               <w:t>TicketGroupSize</w:t>
             </w:r>
-            <w:r>
-              <w:rPr>
-                <w:sz w:val="18"/>
-              </w:rPr>
-              <w:t xml:space="preserve"> = pasajeros con el mismo </w:t>
+            <w:proofErr w:type="spellEnd"/>
+            <w:r>
+              <w:rPr>
+                <w:sz w:val="18"/>
+              </w:rPr>
+              <w:t xml:space="preserve"> = </w:t>
+            </w:r>
+            <w:proofErr w:type="spellStart"/>
+            <w:r>
+              <w:rPr>
+                <w:sz w:val="18"/>
+              </w:rPr>
+              <w:t>pasajeros</w:t>
+            </w:r>
+            <w:proofErr w:type="spellEnd"/>
+            <w:r>
+              <w:rPr>
+                <w:sz w:val="18"/>
+              </w:rPr>
+              <w:t xml:space="preserve"> con el </w:t>
+            </w:r>
+            <w:proofErr w:type="spellStart"/>
+            <w:r>
+              <w:rPr>
+                <w:sz w:val="18"/>
+              </w:rPr>
+              <w:t>mismo</w:t>
+            </w:r>
+            <w:proofErr w:type="spellEnd"/>
+            <w:r>
+              <w:rPr>
+                <w:sz w:val="18"/>
+              </w:rPr>
+              <w:t xml:space="preserve"> </w:t>
             </w:r>
             <w:r>
               <w:rPr>
@@ -2321,13 +2229,16 @@
               </w:rPr>
               <w:t xml:space="preserve">; </w:t>
             </w:r>
+            <w:proofErr w:type="spellStart"/>
             <w:r>
               <w:rPr>
                 <w:rFonts w:ascii="Consolas" w:eastAsia="Consolas" w:hAnsi="Consolas"/>
                 <w:sz w:val="15"/>
               </w:rPr>
+              <w:lastRenderedPageBreak/>
               <w:t>Fare_per_person</w:t>
             </w:r>
+            <w:proofErr w:type="spellEnd"/>
             <w:r>
               <w:rPr>
                 <w:sz w:val="18"/>
@@ -2347,6 +2258,7 @@
               </w:rPr>
               <w:t xml:space="preserve"> / </w:t>
             </w:r>
+            <w:proofErr w:type="spellStart"/>
             <w:r>
               <w:rPr>
                 <w:rFonts w:ascii="Consolas" w:eastAsia="Consolas" w:hAnsi="Consolas"/>
@@ -2354,6 +2266,7 @@
               </w:rPr>
               <w:t>TicketGroupSize</w:t>
             </w:r>
+            <w:proofErr w:type="spellEnd"/>
             <w:r>
               <w:rPr>
                 <w:sz w:val="18"/>
@@ -2388,6 +2301,7 @@
                 <w:sz w:val="18"/>
                 <w:lang w:val="es-CL"/>
               </w:rPr>
+              <w:lastRenderedPageBreak/>
               <w:t xml:space="preserve">134 </w:t>
             </w:r>
             <w:proofErr w:type="gramStart"/>
@@ -2427,6 +2341,7 @@
                 <w:rFonts w:ascii="Consolas" w:eastAsia="Consolas" w:hAnsi="Consolas"/>
                 <w:sz w:val="15"/>
               </w:rPr>
+              <w:lastRenderedPageBreak/>
               <w:t>TicketGroupSize</w:t>
             </w:r>
             <w:proofErr w:type="spellEnd"/>
@@ -2463,7 +2378,21 @@
               <w:rPr>
                 <w:sz w:val="18"/>
               </w:rPr>
-              <w:t xml:space="preserve"> en 32.3 %. Con </w:t>
+              <w:t xml:space="preserve"> </w:t>
+            </w:r>
+            <w:proofErr w:type="spellStart"/>
+            <w:r>
+              <w:rPr>
+                <w:sz w:val="18"/>
+              </w:rPr>
+              <w:t>en</w:t>
+            </w:r>
+            <w:proofErr w:type="spellEnd"/>
+            <w:r>
+              <w:rPr>
+                <w:sz w:val="18"/>
+              </w:rPr>
+              <w:t xml:space="preserve"> 32.3 %. Con </w:t>
             </w:r>
             <w:r>
               <w:rPr>
@@ -2476,14 +2405,41 @@
               <w:rPr>
                 <w:sz w:val="18"/>
               </w:rPr>
-              <w:t>: Mann-Whitney U = 58 829.5 (Mann &amp; Whitney, 1947), p = 6.3×10⁻²¹, r rango-biserial = 0.373 (medianas 8.05 vs. 13.00).</w:t>
+              <w:t xml:space="preserve">: Mann-Whitney (Mann &amp; Whitney, 1947), p = 6.3×10⁻²¹, r </w:t>
+            </w:r>
+            <w:proofErr w:type="spellStart"/>
+            <w:r>
+              <w:rPr>
+                <w:sz w:val="18"/>
+              </w:rPr>
+              <w:t>rango</w:t>
+            </w:r>
+            <w:proofErr w:type="spellEnd"/>
+            <w:r>
+              <w:rPr>
+                <w:sz w:val="18"/>
+              </w:rPr>
+              <w:t>-biserial = 0.373 (</w:t>
+            </w:r>
+            <w:proofErr w:type="spellStart"/>
+            <w:r>
+              <w:rPr>
+                <w:sz w:val="18"/>
+              </w:rPr>
+              <w:t>medianas</w:t>
+            </w:r>
+            <w:proofErr w:type="spellEnd"/>
+            <w:r>
+              <w:rPr>
+                <w:sz w:val="18"/>
+              </w:rPr>
+              <w:t xml:space="preserve"> 8.05 vs. 13.00).</w:t>
             </w:r>
           </w:p>
         </w:tc>
       </w:tr>
       <w:tr>
         <w:trPr>
-          <w:cantSplit/>
           <w:jc w:val="center"/>
         </w:trPr>
         <w:tc>
@@ -2494,13 +2450,16 @@
             <w:pPr>
               <w:spacing w:after="0" w:line="240" w:lineRule="auto"/>
             </w:pPr>
+            <w:proofErr w:type="spellStart"/>
             <w:r>
               <w:rPr>
                 <w:rFonts w:ascii="Consolas" w:eastAsia="Consolas" w:hAnsi="Consolas"/>
                 <w:sz w:val="15"/>
               </w:rPr>
+              <w:lastRenderedPageBreak/>
               <w:t>Sex_Pclass</w:t>
             </w:r>
+            <w:proofErr w:type="spellEnd"/>
           </w:p>
         </w:tc>
         <w:tc>
@@ -2718,7 +2677,7 @@
         <w:rPr>
           <w:lang w:val="es-CL"/>
         </w:rPr>
-        <w:t xml:space="preserve"> el Spearman parcial de </w:t>
+        <w:t xml:space="preserve"> controlando por el tamaño del grupo, el Spearman parcial de </w:t>
       </w:r>
       <w:proofErr w:type="spellStart"/>
       <w:r>
@@ -2750,7 +2709,7 @@
         <w:rPr>
           <w:lang w:val="es-CL"/>
         </w:rPr>
-        <w:t xml:space="preserve">, controlando por el tamaño del grupo, cae 17.3 % (0.324 → 0.268), y el de </w:t>
+        <w:t xml:space="preserve"> cae 17.3 % y el de </w:t>
       </w:r>
       <w:proofErr w:type="spellStart"/>
       <w:r>
@@ -2766,7 +2725,7 @@
         <w:rPr>
           <w:lang w:val="es-CL"/>
         </w:rPr>
-        <w:t xml:space="preserve"> solo 2.3 % (0.315 → 0.307); con residuos lineales ambas caen ≈ 11 %. Su asociación marginal no supera a la de </w:t>
+        <w:t xml:space="preserve"> solo 2.3 % (≈ 11 % ambas con residuos lineales). Como su asociación marginal no supera a la de </w:t>
       </w:r>
       <w:proofErr w:type="spellStart"/>
       <w:r>
@@ -2782,21 +2741,7 @@
         <w:rPr>
           <w:lang w:val="es-CL"/>
         </w:rPr>
-        <w:t xml:space="preserve"> (rango-</w:t>
-      </w:r>
-      <w:proofErr w:type="spellStart"/>
-      <w:r>
-        <w:rPr>
-          <w:lang w:val="es-CL"/>
-        </w:rPr>
-        <w:t>biserial</w:t>
-      </w:r>
-      <w:proofErr w:type="spellEnd"/>
-      <w:r>
-        <w:rPr>
-          <w:lang w:val="es-CL"/>
-        </w:rPr>
-        <w:t xml:space="preserve"> 0.373 frente a 0.384), así que se prefiere por interpretabilidad y menor confusión con el grupo, no por mayor relevancia (NB §VI.2).</w:t>
+        <w:t xml:space="preserve"> (0.373 frente a 0.384), se prefiere por interpretabilidad, no por mayor relevancia (NB §VI.2).</w:t>
       </w:r>
     </w:p>
     <w:p>
@@ -2982,7 +2927,6 @@
       </w:tblGrid>
       <w:tr>
         <w:trPr>
-          <w:cantSplit/>
           <w:tblHeader/>
           <w:jc w:val="center"/>
         </w:trPr>
@@ -3035,6 +2979,7 @@
             <w:pPr>
               <w:spacing w:after="0" w:line="240" w:lineRule="auto"/>
             </w:pPr>
+            <w:proofErr w:type="spellStart"/>
             <w:r>
               <w:rPr>
                 <w:b/>
@@ -3043,151 +2988,12 @@
               </w:rPr>
               <w:t>Justificación</w:t>
             </w:r>
+            <w:proofErr w:type="spellEnd"/>
           </w:p>
         </w:tc>
       </w:tr>
       <w:tr>
         <w:trPr>
-          <w:cantSplit/>
-          <w:jc w:val="center"/>
-        </w:trPr>
-        <w:tc>
-          <w:tcPr>
-            <w:tcW w:w="1152" w:type="dxa"/>
-          </w:tcPr>
-          <w:p>
-            <w:pPr>
-              <w:spacing w:after="0" w:line="240" w:lineRule="auto"/>
-            </w:pPr>
-            <w:r>
-              <w:rPr>
-                <w:b/>
-                <w:sz w:val="18"/>
-              </w:rPr>
-              <w:t>Priorizar</w:t>
-            </w:r>
-          </w:p>
-        </w:tc>
-        <w:tc>
-          <w:tcPr>
-            <w:tcW w:w="2664" w:type="dxa"/>
-          </w:tcPr>
-          <w:p>
-            <w:pPr>
-              <w:spacing w:after="0" w:line="240" w:lineRule="auto"/>
-            </w:pPr>
-            <w:r>
-              <w:rPr>
-                <w:rFonts w:ascii="Consolas" w:eastAsia="Consolas" w:hAnsi="Consolas"/>
-                <w:sz w:val="15"/>
-              </w:rPr>
-              <w:t>Sex_Pclass</w:t>
-            </w:r>
-            <w:r>
-              <w:rPr>
-                <w:sz w:val="18"/>
-              </w:rPr>
-              <w:t xml:space="preserve">, </w:t>
-            </w:r>
-            <w:r>
-              <w:rPr>
-                <w:rFonts w:ascii="Consolas" w:eastAsia="Consolas" w:hAnsi="Consolas"/>
-                <w:sz w:val="15"/>
-              </w:rPr>
-              <w:t>Title_agrupado</w:t>
-            </w:r>
-          </w:p>
-        </w:tc>
-        <w:tc>
-          <w:tcPr>
-            <w:tcW w:w="5544" w:type="dxa"/>
-          </w:tcPr>
-          <w:p>
-            <w:pPr>
-              <w:spacing w:after="0" w:line="240" w:lineRule="auto"/>
-              <w:rPr>
-                <w:lang w:val="es-CL"/>
-              </w:rPr>
-            </w:pPr>
-            <w:r>
-              <w:rPr>
-                <w:sz w:val="18"/>
-                <w:lang w:val="es-CL"/>
-              </w:rPr>
-              <w:t xml:space="preserve">Mayor relevancia (V = 0.627 y 0.570, fuertes; </w:t>
-            </w:r>
-            <w:r>
-              <w:rPr>
-                <w:i/>
-                <w:sz w:val="18"/>
-                <w:lang w:val="es-CL"/>
-              </w:rPr>
-              <w:t>MI</w:t>
-            </w:r>
-            <w:r>
-              <w:rPr>
-                <w:sz w:val="18"/>
-                <w:lang w:val="es-CL"/>
-              </w:rPr>
-              <w:t xml:space="preserve"> 0.218 y 0.169). </w:t>
-            </w:r>
-            <w:proofErr w:type="spellStart"/>
-            <w:r>
-              <w:rPr>
-                <w:rFonts w:ascii="Consolas" w:eastAsia="Consolas" w:hAnsi="Consolas"/>
-                <w:sz w:val="15"/>
-                <w:lang w:val="es-CL"/>
-              </w:rPr>
-              <w:t>Title_agrupado</w:t>
-            </w:r>
-            <w:proofErr w:type="spellEnd"/>
-            <w:r>
-              <w:rPr>
-                <w:sz w:val="18"/>
-                <w:lang w:val="es-CL"/>
-              </w:rPr>
-              <w:t xml:space="preserve"> distingue a los niños (</w:t>
-            </w:r>
-            <w:proofErr w:type="gramStart"/>
-            <w:r>
-              <w:rPr>
-                <w:rFonts w:ascii="Consolas" w:eastAsia="Consolas" w:hAnsi="Consolas"/>
-                <w:sz w:val="15"/>
-                <w:lang w:val="es-CL"/>
-              </w:rPr>
-              <w:t>Master</w:t>
-            </w:r>
-            <w:proofErr w:type="gramEnd"/>
-            <w:r>
-              <w:rPr>
-                <w:sz w:val="18"/>
-                <w:lang w:val="es-CL"/>
-              </w:rPr>
-              <w:t xml:space="preserve">); su redundancia con </w:t>
-            </w:r>
-            <w:proofErr w:type="spellStart"/>
-            <w:r>
-              <w:rPr>
-                <w:rFonts w:ascii="Consolas" w:eastAsia="Consolas" w:hAnsi="Consolas"/>
-                <w:sz w:val="15"/>
-                <w:lang w:val="es-CL"/>
-              </w:rPr>
-              <w:t>Sex_Pclass</w:t>
-            </w:r>
-            <w:proofErr w:type="spellEnd"/>
-            <w:r>
-              <w:rPr>
-                <w:sz w:val="18"/>
-                <w:lang w:val="es-CL"/>
-              </w:rPr>
-              <w:t xml:space="preserve"> es solo parcial (R² = 0.989).</w:t>
-            </w:r>
-          </w:p>
-        </w:tc>
-      </w:tr>
-      <w:tr>
-        <w:trPr>
-          <w:cantSplit/>
           <w:jc w:val="center"/>
         </w:trPr>
         <w:tc>
@@ -3204,7 +3010,7 @@
                 <w:b/>
                 <w:sz w:val="18"/>
               </w:rPr>
-              <w:t>Conservar</w:t>
+              <w:t>Priorizar</w:t>
             </w:r>
             <w:proofErr w:type="spellEnd"/>
           </w:p>
@@ -3217,39 +3023,30 @@
             <w:pPr>
               <w:spacing w:after="0" w:line="240" w:lineRule="auto"/>
             </w:pPr>
+            <w:proofErr w:type="spellStart"/>
             <w:r>
               <w:rPr>
                 <w:rFonts w:ascii="Consolas" w:eastAsia="Consolas" w:hAnsi="Consolas"/>
                 <w:sz w:val="15"/>
               </w:rPr>
-              <w:t>Fare_per_person_log</w:t>
-            </w:r>
+              <w:t>Sex_Pclass</w:t>
+            </w:r>
+            <w:proofErr w:type="spellEnd"/>
             <w:r>
               <w:rPr>
                 <w:sz w:val="18"/>
               </w:rPr>
               <w:t xml:space="preserve">, </w:t>
             </w:r>
+            <w:proofErr w:type="spellStart"/>
             <w:r>
               <w:rPr>
                 <w:rFonts w:ascii="Consolas" w:eastAsia="Consolas" w:hAnsi="Consolas"/>
                 <w:sz w:val="15"/>
               </w:rPr>
-              <w:t>FamilySize</w:t>
-            </w:r>
-            <w:r>
-              <w:rPr>
-                <w:sz w:val="18"/>
-              </w:rPr>
-              <w:t xml:space="preserve">, </w:t>
-            </w:r>
-            <w:r>
-              <w:rPr>
-                <w:rFonts w:ascii="Consolas" w:eastAsia="Consolas" w:hAnsi="Consolas"/>
-                <w:sz w:val="15"/>
-              </w:rPr>
-              <w:t>TicketGroupSize</w:t>
-            </w:r>
+              <w:t>Title_agrupado</w:t>
+            </w:r>
+            <w:proofErr w:type="spellEnd"/>
           </w:p>
         </w:tc>
         <w:tc>
@@ -3263,6 +3060,28 @@
                 <w:lang w:val="es-CL"/>
               </w:rPr>
             </w:pPr>
+            <w:r>
+              <w:rPr>
+                <w:sz w:val="18"/>
+                <w:lang w:val="es-CL"/>
+              </w:rPr>
+              <w:t xml:space="preserve">Mayor relevancia (V = 0.627 y 0.570, fuertes; </w:t>
+            </w:r>
+            <w:r>
+              <w:rPr>
+                <w:i/>
+                <w:sz w:val="18"/>
+                <w:lang w:val="es-CL"/>
+              </w:rPr>
+              <w:t>MI</w:t>
+            </w:r>
+            <w:r>
+              <w:rPr>
+                <w:sz w:val="18"/>
+                <w:lang w:val="es-CL"/>
+              </w:rPr>
+              <w:t xml:space="preserve"> 0.218 y 0.169). </w:t>
+            </w:r>
             <w:proofErr w:type="spellStart"/>
             <w:r>
               <w:rPr>
@@ -3270,7 +3089,7 @@
                 <w:sz w:val="15"/>
                 <w:lang w:val="es-CL"/>
               </w:rPr>
-              <w:t>Fare_per_person_log</w:t>
+              <w:t>Title_agrupado</w:t>
             </w:r>
             <w:proofErr w:type="spellEnd"/>
             <w:r>
@@ -3278,24 +3097,24 @@
                 <w:sz w:val="18"/>
                 <w:lang w:val="es-CL"/>
               </w:rPr>
-              <w:t xml:space="preserve">: asociación moderada (0.373), menos dependiente del grupo; reemplaza a </w:t>
-            </w:r>
-            <w:proofErr w:type="spellStart"/>
+              <w:t xml:space="preserve"> distingue a los niños (</w:t>
+            </w:r>
+            <w:proofErr w:type="gramStart"/>
             <w:r>
               <w:rPr>
                 <w:rFonts w:ascii="Consolas" w:eastAsia="Consolas" w:hAnsi="Consolas"/>
                 <w:sz w:val="15"/>
                 <w:lang w:val="es-CL"/>
               </w:rPr>
-              <w:t>Fare_log</w:t>
-            </w:r>
-            <w:proofErr w:type="spellEnd"/>
+              <w:t>Master</w:t>
+            </w:r>
+            <w:proofErr w:type="gramEnd"/>
             <w:r>
               <w:rPr>
                 <w:sz w:val="18"/>
                 <w:lang w:val="es-CL"/>
               </w:rPr>
-              <w:t xml:space="preserve"> por interpretabilidad. </w:t>
+              <w:t xml:space="preserve">); comparte con </w:t>
             </w:r>
             <w:proofErr w:type="spellStart"/>
             <w:r>
@@ -3304,7 +3123,7 @@
                 <w:sz w:val="15"/>
                 <w:lang w:val="es-CL"/>
               </w:rPr>
-              <w:t>FamilySize</w:t>
+              <w:t>Sex_Pclass</w:t>
             </w:r>
             <w:proofErr w:type="spellEnd"/>
             <w:r>
@@ -3312,16 +3131,15 @@
                 <w:sz w:val="18"/>
                 <w:lang w:val="es-CL"/>
               </w:rPr>
-              <w:t xml:space="preserve"> (0.173; p = 8×10⁻⁷) y </w:t>
+              <w:t xml:space="preserve"> la información de sexo (R² = 0.989 al predecir Sex desde </w:t>
             </w:r>
             <w:proofErr w:type="spellStart"/>
             <w:r>
               <w:rPr>
-                <w:rFonts w:ascii="Consolas" w:eastAsia="Consolas" w:hAnsi="Consolas"/>
-                <w:sz w:val="15"/>
+                <w:sz w:val="18"/>
                 <w:lang w:val="es-CL"/>
               </w:rPr>
-              <w:t>TicketGroupSize</w:t>
+              <w:t>Title_agrupado</w:t>
             </w:r>
             <w:proofErr w:type="spellEnd"/>
             <w:r>
@@ -3329,14 +3147,13 @@
                 <w:sz w:val="18"/>
                 <w:lang w:val="es-CL"/>
               </w:rPr>
-              <w:t xml:space="preserve"> (0.188; p = 6×10⁻⁸): débiles pero significativas y conceptos distintos (32.3 %).</w:t>
+              <w:t>), pero no de forma exacta.</w:t>
             </w:r>
           </w:p>
         </w:tc>
       </w:tr>
       <w:tr>
         <w:trPr>
-          <w:cantSplit/>
           <w:jc w:val="center"/>
         </w:trPr>
         <w:tc>
@@ -3353,7 +3170,7 @@
                 <w:b/>
                 <w:sz w:val="18"/>
               </w:rPr>
-              <w:t>Revisar</w:t>
+              <w:t>Conservar</w:t>
             </w:r>
             <w:proofErr w:type="spellEnd"/>
           </w:p>
@@ -3366,39 +3183,45 @@
             <w:pPr>
               <w:spacing w:after="0" w:line="240" w:lineRule="auto"/>
             </w:pPr>
+            <w:proofErr w:type="spellStart"/>
             <w:r>
               <w:rPr>
                 <w:rFonts w:ascii="Consolas" w:eastAsia="Consolas" w:hAnsi="Consolas"/>
                 <w:sz w:val="15"/>
               </w:rPr>
-              <w:t>AgeGroup</w:t>
-            </w:r>
+              <w:t>Fare_per_person_log</w:t>
+            </w:r>
+            <w:proofErr w:type="spellEnd"/>
             <w:r>
               <w:rPr>
                 <w:sz w:val="18"/>
               </w:rPr>
               <w:t xml:space="preserve">, </w:t>
             </w:r>
+            <w:proofErr w:type="spellStart"/>
             <w:r>
               <w:rPr>
                 <w:rFonts w:ascii="Consolas" w:eastAsia="Consolas" w:hAnsi="Consolas"/>
                 <w:sz w:val="15"/>
               </w:rPr>
-              <w:t>Embarked_clean</w:t>
-            </w:r>
+              <w:t>FamilySize</w:t>
+            </w:r>
+            <w:proofErr w:type="spellEnd"/>
             <w:r>
               <w:rPr>
                 <w:sz w:val="18"/>
               </w:rPr>
               <w:t xml:space="preserve">, </w:t>
             </w:r>
+            <w:proofErr w:type="spellStart"/>
             <w:r>
               <w:rPr>
                 <w:rFonts w:ascii="Consolas" w:eastAsia="Consolas" w:hAnsi="Consolas"/>
                 <w:sz w:val="15"/>
               </w:rPr>
-              <w:t>Deck_combinado</w:t>
-            </w:r>
+              <w:t>TicketGroupSize</w:t>
+            </w:r>
+            <w:proofErr w:type="spellEnd"/>
           </w:p>
         </w:tc>
         <w:tc>
@@ -3419,7 +3242,7 @@
                 <w:sz w:val="15"/>
                 <w:lang w:val="es-CL"/>
               </w:rPr>
-              <w:t>AgeGroup</w:t>
+              <w:t>Fare_per_person_log</w:t>
             </w:r>
             <w:proofErr w:type="spellEnd"/>
             <w:r>
@@ -3427,7 +3250,7 @@
                 <w:sz w:val="18"/>
                 <w:lang w:val="es-CL"/>
               </w:rPr>
-              <w:t xml:space="preserve"> (V = 0.137) y </w:t>
+              <w:t xml:space="preserve">: asociación moderada (0.373), menos dependiente del grupo; reemplaza a </w:t>
             </w:r>
             <w:proofErr w:type="spellStart"/>
             <w:r>
@@ -3436,7 +3259,7 @@
                 <w:sz w:val="15"/>
                 <w:lang w:val="es-CL"/>
               </w:rPr>
-              <w:t>Embarked_clean</w:t>
+              <w:t>Fare_log</w:t>
             </w:r>
             <w:proofErr w:type="spellEnd"/>
             <w:r>
@@ -3444,22 +3267,7 @@
                 <w:sz w:val="18"/>
                 <w:lang w:val="es-CL"/>
               </w:rPr>
-              <w:t xml:space="preserve"> (V = 0.171): asociación débil e </w:t>
-            </w:r>
-            <w:r>
-              <w:rPr>
-                <w:i/>
-                <w:sz w:val="18"/>
-                <w:lang w:val="es-CL"/>
-              </w:rPr>
-              <w:t>MI</w:t>
-            </w:r>
-            <w:r>
-              <w:rPr>
-                <w:sz w:val="18"/>
-                <w:lang w:val="es-CL"/>
-              </w:rPr>
-              <w:t xml:space="preserve"> marginal (0.009 y 0.014); se mantienen por sentido sustantivo; el puerto refleja en parte la clase (V con </w:t>
+              <w:t xml:space="preserve"> por interpretabilidad. </w:t>
             </w:r>
             <w:proofErr w:type="spellStart"/>
             <w:r>
@@ -3468,7 +3276,7 @@
                 <w:sz w:val="15"/>
                 <w:lang w:val="es-CL"/>
               </w:rPr>
-              <w:t>Pclass</w:t>
+              <w:t>FamilySize</w:t>
             </w:r>
             <w:proofErr w:type="spellEnd"/>
             <w:r>
@@ -3476,7 +3284,7 @@
                 <w:sz w:val="18"/>
                 <w:lang w:val="es-CL"/>
               </w:rPr>
-              <w:t xml:space="preserve"> = 0.262). </w:t>
+              <w:t xml:space="preserve"> (0.173; p = 8×10⁻⁷) y </w:t>
             </w:r>
             <w:proofErr w:type="spellStart"/>
             <w:r>
@@ -3485,7 +3293,7 @@
                 <w:sz w:val="15"/>
                 <w:lang w:val="es-CL"/>
               </w:rPr>
-              <w:t>Deck_combinado</w:t>
+              <w:t>TicketGroupSize</w:t>
             </w:r>
             <w:proofErr w:type="spellEnd"/>
             <w:r>
@@ -3493,14 +3301,13 @@
                 <w:sz w:val="18"/>
                 <w:lang w:val="es-CL"/>
               </w:rPr>
-              <w:t>: V = 0.334 (moderada), pero 27.8 % de celdas esperadas &lt; 5 y 77.1 % «Desconocida» (no imputada).</w:t>
+              <w:t xml:space="preserve"> (0.188; p = 6×10⁻⁸): débiles pero significativas y conceptos distintos (32.3 %).</w:t>
             </w:r>
           </w:p>
         </w:tc>
       </w:tr>
       <w:tr>
         <w:trPr>
-          <w:cantSplit/>
           <w:jc w:val="center"/>
         </w:trPr>
         <w:tc>
@@ -3517,8 +3324,7 @@
                 <w:b/>
                 <w:sz w:val="18"/>
               </w:rPr>
-              <w:lastRenderedPageBreak/>
-              <w:t>Descartar</w:t>
+              <w:t>Revisar</w:t>
             </w:r>
             <w:proofErr w:type="spellEnd"/>
           </w:p>
@@ -3531,182 +3337,45 @@
             <w:pPr>
               <w:spacing w:after="0" w:line="240" w:lineRule="auto"/>
             </w:pPr>
+            <w:proofErr w:type="spellStart"/>
             <w:r>
               <w:rPr>
                 <w:rFonts w:ascii="Consolas" w:eastAsia="Consolas" w:hAnsi="Consolas"/>
                 <w:sz w:val="15"/>
               </w:rPr>
-              <w:t>Pclass</w:t>
-            </w:r>
+              <w:t>AgeGroup</w:t>
+            </w:r>
+            <w:proofErr w:type="spellEnd"/>
             <w:r>
               <w:rPr>
                 <w:sz w:val="18"/>
               </w:rPr>
               <w:t xml:space="preserve">, </w:t>
             </w:r>
+            <w:proofErr w:type="spellStart"/>
             <w:r>
               <w:rPr>
                 <w:rFonts w:ascii="Consolas" w:eastAsia="Consolas" w:hAnsi="Consolas"/>
                 <w:sz w:val="15"/>
               </w:rPr>
-              <w:t>Age_clean</w:t>
-            </w:r>
+              <w:t>Embarked_clean</w:t>
+            </w:r>
+            <w:proofErr w:type="spellEnd"/>
             <w:r>
               <w:rPr>
                 <w:sz w:val="18"/>
               </w:rPr>
               <w:t xml:space="preserve">, </w:t>
             </w:r>
+            <w:proofErr w:type="spellStart"/>
             <w:r>
               <w:rPr>
                 <w:rFonts w:ascii="Consolas" w:eastAsia="Consolas" w:hAnsi="Consolas"/>
                 <w:sz w:val="15"/>
               </w:rPr>
-              <w:t>Sex_bin</w:t>
-            </w:r>
-            <w:r>
-              <w:rPr>
-                <w:sz w:val="18"/>
-              </w:rPr>
-              <w:t xml:space="preserve">, </w:t>
-            </w:r>
-            <w:r>
-              <w:rPr>
-                <w:rFonts w:ascii="Consolas" w:eastAsia="Consolas" w:hAnsi="Consolas"/>
-                <w:sz w:val="15"/>
-              </w:rPr>
-              <w:t>Fare_log</w:t>
-            </w:r>
-            <w:r>
-              <w:rPr>
-                <w:sz w:val="18"/>
-              </w:rPr>
-              <w:t xml:space="preserve">, </w:t>
-            </w:r>
-            <w:r>
-              <w:rPr>
-                <w:rFonts w:ascii="Consolas" w:eastAsia="Consolas" w:hAnsi="Consolas"/>
-                <w:sz w:val="15"/>
-              </w:rPr>
-              <w:t>FareBand</w:t>
-            </w:r>
-            <w:r>
-              <w:rPr>
-                <w:sz w:val="18"/>
-              </w:rPr>
-              <w:t xml:space="preserve">, </w:t>
-            </w:r>
-            <w:r>
-              <w:rPr>
-                <w:rFonts w:ascii="Consolas" w:eastAsia="Consolas" w:hAnsi="Consolas"/>
-                <w:sz w:val="15"/>
-              </w:rPr>
-              <w:t>IsAlone</w:t>
-            </w:r>
-            <w:r>
-              <w:rPr>
-                <w:sz w:val="18"/>
-              </w:rPr>
-              <w:t xml:space="preserve">, </w:t>
-            </w:r>
-            <w:r>
-              <w:rPr>
-                <w:rFonts w:ascii="Consolas" w:eastAsia="Consolas" w:hAnsi="Consolas"/>
-                <w:sz w:val="15"/>
-              </w:rPr>
-              <w:t>Age_registrada</w:t>
-            </w:r>
-            <w:r>
-              <w:rPr>
-                <w:sz w:val="18"/>
-              </w:rPr>
-              <w:t xml:space="preserve">, </w:t>
-            </w:r>
-            <w:r>
-              <w:rPr>
-                <w:rFonts w:ascii="Consolas" w:eastAsia="Consolas" w:hAnsi="Consolas"/>
-                <w:sz w:val="15"/>
-              </w:rPr>
-              <w:t>Cabin_registrada</w:t>
-            </w:r>
-            <w:r>
-              <w:rPr>
-                <w:sz w:val="18"/>
-              </w:rPr>
-              <w:t xml:space="preserve">, </w:t>
-            </w:r>
-            <w:r>
-              <w:rPr>
-                <w:rFonts w:ascii="Consolas" w:eastAsia="Consolas" w:hAnsi="Consolas"/>
-                <w:sz w:val="15"/>
-              </w:rPr>
-              <w:t>class</w:t>
-            </w:r>
-            <w:r>
-              <w:rPr>
-                <w:sz w:val="18"/>
-              </w:rPr>
-              <w:t xml:space="preserve">, </w:t>
-            </w:r>
-            <w:r>
-              <w:rPr>
-                <w:rFonts w:ascii="Consolas" w:eastAsia="Consolas" w:hAnsi="Consolas"/>
-                <w:sz w:val="15"/>
-              </w:rPr>
-              <w:t>who</w:t>
-            </w:r>
-            <w:r>
-              <w:rPr>
-                <w:sz w:val="18"/>
-              </w:rPr>
-              <w:t xml:space="preserve">, </w:t>
-            </w:r>
-            <w:r>
-              <w:rPr>
-                <w:rFonts w:ascii="Consolas" w:eastAsia="Consolas" w:hAnsi="Consolas"/>
-                <w:sz w:val="15"/>
-              </w:rPr>
-              <w:t>adult_male</w:t>
-            </w:r>
-            <w:r>
-              <w:rPr>
-                <w:sz w:val="18"/>
-              </w:rPr>
-              <w:t xml:space="preserve">, </w:t>
-            </w:r>
-            <w:r>
-              <w:rPr>
-                <w:rFonts w:ascii="Consolas" w:eastAsia="Consolas" w:hAnsi="Consolas"/>
-                <w:sz w:val="15"/>
-              </w:rPr>
-              <w:t>deck</w:t>
-            </w:r>
-            <w:r>
-              <w:rPr>
-                <w:sz w:val="18"/>
-              </w:rPr>
-              <w:t xml:space="preserve">, </w:t>
-            </w:r>
-            <w:r>
-              <w:rPr>
-                <w:rFonts w:ascii="Consolas" w:eastAsia="Consolas" w:hAnsi="Consolas"/>
-                <w:sz w:val="15"/>
-              </w:rPr>
-              <w:t>embark_town</w:t>
-            </w:r>
-            <w:r>
-              <w:rPr>
-                <w:sz w:val="18"/>
-              </w:rPr>
-              <w:t xml:space="preserve">, </w:t>
-            </w:r>
-            <w:r>
-              <w:rPr>
-                <w:rFonts w:ascii="Consolas" w:eastAsia="Consolas" w:hAnsi="Consolas"/>
-                <w:sz w:val="15"/>
-              </w:rPr>
-              <w:t>alone</w:t>
-            </w:r>
+              <w:t>Deck_combinado</w:t>
+            </w:r>
+            <w:proofErr w:type="spellEnd"/>
           </w:p>
         </w:tc>
         <w:tc>
@@ -3727,7 +3396,7 @@
                 <w:sz w:val="15"/>
                 <w:lang w:val="es-CL"/>
               </w:rPr>
-              <w:t>Pclass</w:t>
+              <w:t>AgeGroup</w:t>
             </w:r>
             <w:proofErr w:type="spellEnd"/>
             <w:r>
@@ -3735,7 +3404,7 @@
                 <w:sz w:val="18"/>
                 <w:lang w:val="es-CL"/>
               </w:rPr>
-              <w:t xml:space="preserve">: combinación lineal exacta de </w:t>
+              <w:t xml:space="preserve"> (V = 0.137) y </w:t>
             </w:r>
             <w:proofErr w:type="spellStart"/>
             <w:r>
@@ -3744,7 +3413,7 @@
                 <w:sz w:val="15"/>
                 <w:lang w:val="es-CL"/>
               </w:rPr>
-              <w:t>Sex_Pclass</w:t>
+              <w:t>Embarked_clean</w:t>
             </w:r>
             <w:proofErr w:type="spellEnd"/>
             <w:r>
@@ -3752,7 +3421,22 @@
                 <w:sz w:val="18"/>
                 <w:lang w:val="es-CL"/>
               </w:rPr>
-              <w:t xml:space="preserve">. </w:t>
+              <w:t xml:space="preserve"> (V = 0.171): asociación débil e </w:t>
+            </w:r>
+            <w:r>
+              <w:rPr>
+                <w:i/>
+                <w:sz w:val="18"/>
+                <w:lang w:val="es-CL"/>
+              </w:rPr>
+              <w:t>MI</w:t>
+            </w:r>
+            <w:r>
+              <w:rPr>
+                <w:sz w:val="18"/>
+                <w:lang w:val="es-CL"/>
+              </w:rPr>
+              <w:t xml:space="preserve"> marginal (0.009 y 0.014); se mantienen por sentido sustantivo; el puerto refleja en parte la clase (V con </w:t>
             </w:r>
             <w:proofErr w:type="spellStart"/>
             <w:r>
@@ -3761,7 +3445,7 @@
                 <w:sz w:val="15"/>
                 <w:lang w:val="es-CL"/>
               </w:rPr>
-              <w:t>IsAlone</w:t>
+              <w:t>Pclass</w:t>
             </w:r>
             <w:proofErr w:type="spellEnd"/>
             <w:r>
@@ -3769,7 +3453,7 @@
                 <w:sz w:val="18"/>
                 <w:lang w:val="es-CL"/>
               </w:rPr>
-              <w:t xml:space="preserve">: función de </w:t>
+              <w:t xml:space="preserve"> = 0.262). </w:t>
             </w:r>
             <w:proofErr w:type="spellStart"/>
             <w:r>
@@ -3778,7 +3462,7 @@
                 <w:sz w:val="15"/>
                 <w:lang w:val="es-CL"/>
               </w:rPr>
-              <w:t>FamilySize</w:t>
+              <w:t>Deck_combinado</w:t>
             </w:r>
             <w:proofErr w:type="spellEnd"/>
             <w:r>
@@ -3786,8 +3470,251 @@
                 <w:sz w:val="18"/>
                 <w:lang w:val="es-CL"/>
               </w:rPr>
-              <w:t xml:space="preserve">. </w:t>
-            </w:r>
+              <w:t>: V = 0.334 (moderada), pero 27.8 % de celdas esperadas &lt; 5 y 77.1 % «Desconocida» (no imputada).</w:t>
+            </w:r>
+          </w:p>
+        </w:tc>
+      </w:tr>
+      <w:tr>
+        <w:trPr>
+          <w:jc w:val="center"/>
+        </w:trPr>
+        <w:tc>
+          <w:tcPr>
+            <w:tcW w:w="1152" w:type="dxa"/>
+          </w:tcPr>
+          <w:p>
+            <w:pPr>
+              <w:spacing w:after="0" w:line="240" w:lineRule="auto"/>
+            </w:pPr>
+            <w:proofErr w:type="spellStart"/>
+            <w:r>
+              <w:rPr>
+                <w:b/>
+                <w:sz w:val="18"/>
+              </w:rPr>
+              <w:t>Descartar</w:t>
+            </w:r>
+            <w:proofErr w:type="spellEnd"/>
+          </w:p>
+        </w:tc>
+        <w:tc>
+          <w:tcPr>
+            <w:tcW w:w="2664" w:type="dxa"/>
+          </w:tcPr>
+          <w:p>
+            <w:pPr>
+              <w:spacing w:after="0" w:line="240" w:lineRule="auto"/>
+            </w:pPr>
+            <w:proofErr w:type="spellStart"/>
+            <w:r>
+              <w:rPr>
+                <w:rFonts w:ascii="Consolas" w:eastAsia="Consolas" w:hAnsi="Consolas"/>
+                <w:sz w:val="15"/>
+              </w:rPr>
+              <w:t>Pclass</w:t>
+            </w:r>
+            <w:proofErr w:type="spellEnd"/>
+            <w:r>
+              <w:rPr>
+                <w:sz w:val="18"/>
+              </w:rPr>
+              <w:t xml:space="preserve">, </w:t>
+            </w:r>
+            <w:proofErr w:type="spellStart"/>
+            <w:r>
+              <w:rPr>
+                <w:rFonts w:ascii="Consolas" w:eastAsia="Consolas" w:hAnsi="Consolas"/>
+                <w:sz w:val="15"/>
+              </w:rPr>
+              <w:t>Age_clean</w:t>
+            </w:r>
+            <w:proofErr w:type="spellEnd"/>
+            <w:r>
+              <w:rPr>
+                <w:sz w:val="18"/>
+              </w:rPr>
+              <w:t xml:space="preserve">, </w:t>
+            </w:r>
+            <w:proofErr w:type="spellStart"/>
+            <w:r>
+              <w:rPr>
+                <w:rFonts w:ascii="Consolas" w:eastAsia="Consolas" w:hAnsi="Consolas"/>
+                <w:sz w:val="15"/>
+              </w:rPr>
+              <w:t>Sex_bin</w:t>
+            </w:r>
+            <w:proofErr w:type="spellEnd"/>
+            <w:r>
+              <w:rPr>
+                <w:sz w:val="18"/>
+              </w:rPr>
+              <w:t xml:space="preserve">, </w:t>
+            </w:r>
+            <w:proofErr w:type="spellStart"/>
+            <w:r>
+              <w:rPr>
+                <w:rFonts w:ascii="Consolas" w:eastAsia="Consolas" w:hAnsi="Consolas"/>
+                <w:sz w:val="15"/>
+              </w:rPr>
+              <w:t>Fare_log</w:t>
+            </w:r>
+            <w:proofErr w:type="spellEnd"/>
+            <w:r>
+              <w:rPr>
+                <w:sz w:val="18"/>
+              </w:rPr>
+              <w:t xml:space="preserve">, </w:t>
+            </w:r>
+            <w:proofErr w:type="spellStart"/>
+            <w:r>
+              <w:rPr>
+                <w:rFonts w:ascii="Consolas" w:eastAsia="Consolas" w:hAnsi="Consolas"/>
+                <w:sz w:val="15"/>
+              </w:rPr>
+              <w:t>FareBand</w:t>
+            </w:r>
+            <w:proofErr w:type="spellEnd"/>
+            <w:r>
+              <w:rPr>
+                <w:sz w:val="18"/>
+              </w:rPr>
+              <w:t xml:space="preserve">, </w:t>
+            </w:r>
+            <w:proofErr w:type="spellStart"/>
+            <w:r>
+              <w:rPr>
+                <w:rFonts w:ascii="Consolas" w:eastAsia="Consolas" w:hAnsi="Consolas"/>
+                <w:sz w:val="15"/>
+              </w:rPr>
+              <w:t>IsAlone</w:t>
+            </w:r>
+            <w:proofErr w:type="spellEnd"/>
+            <w:r>
+              <w:rPr>
+                <w:sz w:val="18"/>
+              </w:rPr>
+              <w:t xml:space="preserve">, </w:t>
+            </w:r>
+            <w:proofErr w:type="spellStart"/>
+            <w:r>
+              <w:rPr>
+                <w:rFonts w:ascii="Consolas" w:eastAsia="Consolas" w:hAnsi="Consolas"/>
+                <w:sz w:val="15"/>
+              </w:rPr>
+              <w:t>Age_registrada</w:t>
+            </w:r>
+            <w:proofErr w:type="spellEnd"/>
+            <w:r>
+              <w:rPr>
+                <w:sz w:val="18"/>
+              </w:rPr>
+              <w:t xml:space="preserve">, </w:t>
+            </w:r>
+            <w:proofErr w:type="spellStart"/>
+            <w:r>
+              <w:rPr>
+                <w:rFonts w:ascii="Consolas" w:eastAsia="Consolas" w:hAnsi="Consolas"/>
+                <w:sz w:val="15"/>
+              </w:rPr>
+              <w:t>Cabin_registrada</w:t>
+            </w:r>
+            <w:proofErr w:type="spellEnd"/>
+            <w:r>
+              <w:rPr>
+                <w:sz w:val="18"/>
+              </w:rPr>
+              <w:t xml:space="preserve">, </w:t>
+            </w:r>
+            <w:r>
+              <w:rPr>
+                <w:rFonts w:ascii="Consolas" w:eastAsia="Consolas" w:hAnsi="Consolas"/>
+                <w:sz w:val="15"/>
+              </w:rPr>
+              <w:t>class</w:t>
+            </w:r>
+            <w:r>
+              <w:rPr>
+                <w:sz w:val="18"/>
+              </w:rPr>
+              <w:t xml:space="preserve">, </w:t>
+            </w:r>
+            <w:r>
+              <w:rPr>
+                <w:rFonts w:ascii="Consolas" w:eastAsia="Consolas" w:hAnsi="Consolas"/>
+                <w:sz w:val="15"/>
+              </w:rPr>
+              <w:t>who</w:t>
+            </w:r>
+            <w:r>
+              <w:rPr>
+                <w:sz w:val="18"/>
+              </w:rPr>
+              <w:t xml:space="preserve">, </w:t>
+            </w:r>
+            <w:proofErr w:type="spellStart"/>
+            <w:r>
+              <w:rPr>
+                <w:rFonts w:ascii="Consolas" w:eastAsia="Consolas" w:hAnsi="Consolas"/>
+                <w:sz w:val="15"/>
+              </w:rPr>
+              <w:t>adult_male</w:t>
+            </w:r>
+            <w:proofErr w:type="spellEnd"/>
+            <w:r>
+              <w:rPr>
+                <w:sz w:val="18"/>
+              </w:rPr>
+              <w:t xml:space="preserve">, </w:t>
+            </w:r>
+            <w:r>
+              <w:rPr>
+                <w:rFonts w:ascii="Consolas" w:eastAsia="Consolas" w:hAnsi="Consolas"/>
+                <w:sz w:val="15"/>
+              </w:rPr>
+              <w:t>deck</w:t>
+            </w:r>
+            <w:r>
+              <w:rPr>
+                <w:sz w:val="18"/>
+              </w:rPr>
+              <w:t xml:space="preserve">, </w:t>
+            </w:r>
+            <w:proofErr w:type="spellStart"/>
+            <w:r>
+              <w:rPr>
+                <w:rFonts w:ascii="Consolas" w:eastAsia="Consolas" w:hAnsi="Consolas"/>
+                <w:sz w:val="15"/>
+              </w:rPr>
+              <w:t>embark_town</w:t>
+            </w:r>
+            <w:proofErr w:type="spellEnd"/>
+            <w:r>
+              <w:rPr>
+                <w:sz w:val="18"/>
+              </w:rPr>
+              <w:t xml:space="preserve">, </w:t>
+            </w:r>
+            <w:r>
+              <w:rPr>
+                <w:rFonts w:ascii="Consolas" w:eastAsia="Consolas" w:hAnsi="Consolas"/>
+                <w:sz w:val="15"/>
+              </w:rPr>
+              <w:t>alone</w:t>
+            </w:r>
+          </w:p>
+        </w:tc>
+        <w:tc>
+          <w:tcPr>
+            <w:tcW w:w="5544" w:type="dxa"/>
+          </w:tcPr>
+          <w:p>
+            <w:pPr>
+              <w:spacing w:after="0" w:line="240" w:lineRule="auto"/>
+              <w:rPr>
+                <w:lang w:val="es-CL"/>
+              </w:rPr>
+            </w:pPr>
             <w:proofErr w:type="spellStart"/>
             <w:r>
               <w:rPr>
@@ -3795,7 +3722,7 @@
                 <w:sz w:val="15"/>
                 <w:lang w:val="es-CL"/>
               </w:rPr>
-              <w:t>Sex_bin</w:t>
+              <w:t>Pclass</w:t>
             </w:r>
             <w:proofErr w:type="spellEnd"/>
             <w:r>
@@ -3803,7 +3730,7 @@
                 <w:sz w:val="18"/>
                 <w:lang w:val="es-CL"/>
               </w:rPr>
-              <w:t xml:space="preserve">: V = 0.995 con </w:t>
+              <w:t xml:space="preserve">: combinación lineal exacta de </w:t>
             </w:r>
             <w:proofErr w:type="spellStart"/>
             <w:r>
@@ -3812,7 +3739,7 @@
                 <w:sz w:val="15"/>
                 <w:lang w:val="es-CL"/>
               </w:rPr>
-              <w:t>Title_agrupado</w:t>
+              <w:t>Sex_Pclass</w:t>
             </w:r>
             <w:proofErr w:type="spellEnd"/>
             <w:r>
@@ -3829,7 +3756,7 @@
                 <w:sz w:val="15"/>
                 <w:lang w:val="es-CL"/>
               </w:rPr>
-              <w:t>Fare_log</w:t>
+              <w:t>IsAlone</w:t>
             </w:r>
             <w:proofErr w:type="spellEnd"/>
             <w:r>
@@ -3837,7 +3764,7 @@
                 <w:sz w:val="18"/>
                 <w:lang w:val="es-CL"/>
               </w:rPr>
-              <w:t xml:space="preserve">, </w:t>
+              <w:t xml:space="preserve">: función de </w:t>
             </w:r>
             <w:proofErr w:type="spellStart"/>
             <w:r>
@@ -3846,7 +3773,7 @@
                 <w:sz w:val="15"/>
                 <w:lang w:val="es-CL"/>
               </w:rPr>
-              <w:t>FareBand</w:t>
+              <w:t>FamilySize</w:t>
             </w:r>
             <w:proofErr w:type="spellEnd"/>
             <w:r>
@@ -3854,7 +3781,7 @@
                 <w:sz w:val="18"/>
                 <w:lang w:val="es-CL"/>
               </w:rPr>
-              <w:t xml:space="preserve">: redundantes con </w:t>
+              <w:t xml:space="preserve">. </w:t>
             </w:r>
             <w:proofErr w:type="spellStart"/>
             <w:r>
@@ -3863,7 +3790,7 @@
                 <w:sz w:val="15"/>
                 <w:lang w:val="es-CL"/>
               </w:rPr>
-              <w:t>Fare_per_person_log</w:t>
+              <w:t>Sex_bin</w:t>
             </w:r>
             <w:proofErr w:type="spellEnd"/>
             <w:r>
@@ -3871,7 +3798,7 @@
                 <w:sz w:val="18"/>
                 <w:lang w:val="es-CL"/>
               </w:rPr>
-              <w:t xml:space="preserve">. </w:t>
+              <w:t xml:space="preserve">: V = 0.995 con </w:t>
             </w:r>
             <w:proofErr w:type="spellStart"/>
             <w:r>
@@ -3880,7 +3807,7 @@
                 <w:sz w:val="15"/>
                 <w:lang w:val="es-CL"/>
               </w:rPr>
-              <w:t>Age_clean</w:t>
+              <w:t>Title_agrupado</w:t>
             </w:r>
             <w:proofErr w:type="spellEnd"/>
             <w:r>
@@ -3888,22 +3815,7 @@
                 <w:sz w:val="18"/>
                 <w:lang w:val="es-CL"/>
               </w:rPr>
-              <w:t xml:space="preserve">: Mann-Whitney p = 0.25, pero su </w:t>
-            </w:r>
-            <w:r>
-              <w:rPr>
-                <w:i/>
-                <w:sz w:val="18"/>
-                <w:lang w:val="es-CL"/>
-              </w:rPr>
-              <w:t>MI</w:t>
-            </w:r>
-            <w:r>
-              <w:rPr>
-                <w:sz w:val="18"/>
-                <w:lang w:val="es-CL"/>
-              </w:rPr>
-              <w:t xml:space="preserve"> supera a la de </w:t>
+              <w:t xml:space="preserve">. </w:t>
             </w:r>
             <w:proofErr w:type="spellStart"/>
             <w:r>
@@ -3912,7 +3824,7 @@
                 <w:sz w:val="15"/>
                 <w:lang w:val="es-CL"/>
               </w:rPr>
-              <w:t>AgeGroup</w:t>
+              <w:t>Fare_log</w:t>
             </w:r>
             <w:proofErr w:type="spellEnd"/>
             <w:r>
@@ -3920,7 +3832,7 @@
                 <w:sz w:val="18"/>
                 <w:lang w:val="es-CL"/>
               </w:rPr>
-              <w:t xml:space="preserve">; se descarta por imputación (19.9 %) e interpretabilidad (a revalidar). </w:t>
+              <w:t xml:space="preserve">, </w:t>
             </w:r>
             <w:proofErr w:type="spellStart"/>
             <w:r>
@@ -3929,7 +3841,7 @@
                 <w:sz w:val="15"/>
                 <w:lang w:val="es-CL"/>
               </w:rPr>
-              <w:t>Age_registrada</w:t>
+              <w:t>FareBand</w:t>
             </w:r>
             <w:proofErr w:type="spellEnd"/>
             <w:r>
@@ -3937,7 +3849,7 @@
                 <w:sz w:val="18"/>
                 <w:lang w:val="es-CL"/>
               </w:rPr>
-              <w:t xml:space="preserve"> y </w:t>
+              <w:t xml:space="preserve">: redundantes con </w:t>
             </w:r>
             <w:proofErr w:type="spellStart"/>
             <w:r>
@@ -3946,6 +3858,89 @@
                 <w:sz w:val="15"/>
                 <w:lang w:val="es-CL"/>
               </w:rPr>
+              <w:t>Fare_per_person_log</w:t>
+            </w:r>
+            <w:proofErr w:type="spellEnd"/>
+            <w:r>
+              <w:rPr>
+                <w:sz w:val="18"/>
+                <w:lang w:val="es-CL"/>
+              </w:rPr>
+              <w:t xml:space="preserve">. </w:t>
+            </w:r>
+            <w:proofErr w:type="spellStart"/>
+            <w:r>
+              <w:rPr>
+                <w:rFonts w:ascii="Consolas" w:eastAsia="Consolas" w:hAnsi="Consolas"/>
+                <w:sz w:val="15"/>
+                <w:lang w:val="es-CL"/>
+              </w:rPr>
+              <w:t>Age_clean</w:t>
+            </w:r>
+            <w:proofErr w:type="spellEnd"/>
+            <w:r>
+              <w:rPr>
+                <w:sz w:val="18"/>
+                <w:lang w:val="es-CL"/>
+              </w:rPr>
+              <w:t xml:space="preserve">: Mann-Whitney p = 0.25, pero su </w:t>
+            </w:r>
+            <w:r>
+              <w:rPr>
+                <w:i/>
+                <w:sz w:val="18"/>
+                <w:lang w:val="es-CL"/>
+              </w:rPr>
+              <w:t>MI</w:t>
+            </w:r>
+            <w:r>
+              <w:rPr>
+                <w:sz w:val="18"/>
+                <w:lang w:val="es-CL"/>
+              </w:rPr>
+              <w:t xml:space="preserve"> supera a la de </w:t>
+            </w:r>
+            <w:proofErr w:type="spellStart"/>
+            <w:r>
+              <w:rPr>
+                <w:rFonts w:ascii="Consolas" w:eastAsia="Consolas" w:hAnsi="Consolas"/>
+                <w:sz w:val="15"/>
+                <w:lang w:val="es-CL"/>
+              </w:rPr>
+              <w:t>AgeGroup</w:t>
+            </w:r>
+            <w:proofErr w:type="spellEnd"/>
+            <w:r>
+              <w:rPr>
+                <w:sz w:val="18"/>
+                <w:lang w:val="es-CL"/>
+              </w:rPr>
+              <w:t xml:space="preserve">; se descarta por imputación (19.9 %) e interpretabilidad (a revalidar). </w:t>
+            </w:r>
+            <w:proofErr w:type="spellStart"/>
+            <w:r>
+              <w:rPr>
+                <w:rFonts w:ascii="Consolas" w:eastAsia="Consolas" w:hAnsi="Consolas"/>
+                <w:sz w:val="15"/>
+                <w:lang w:val="es-CL"/>
+              </w:rPr>
+              <w:t>Age_registrada</w:t>
+            </w:r>
+            <w:proofErr w:type="spellEnd"/>
+            <w:r>
+              <w:rPr>
+                <w:sz w:val="18"/>
+                <w:lang w:val="es-CL"/>
+              </w:rPr>
+              <w:t xml:space="preserve"> y </w:t>
+            </w:r>
+            <w:proofErr w:type="spellStart"/>
+            <w:r>
+              <w:rPr>
+                <w:rFonts w:ascii="Consolas" w:eastAsia="Consolas" w:hAnsi="Consolas"/>
+                <w:sz w:val="15"/>
+                <w:lang w:val="es-CL"/>
+              </w:rPr>
               <w:t>Cabin_registrada</w:t>
             </w:r>
             <w:proofErr w:type="spellEnd"/>
@@ -3970,7 +3965,7 @@
                 <w:sz w:val="18"/>
                 <w:lang w:val="es-CL"/>
               </w:rPr>
-              <w:t>-data se reconstruyen al 100 %.</w:t>
+              <w:t>-data coinciden con columnas propias (NB §VI.1).</w:t>
             </w:r>
           </w:p>
         </w:tc>
@@ -3991,6 +3986,7 @@
           <w:sz w:val="19"/>
           <w:lang w:val="es-CL"/>
         </w:rPr>
+        <w:lastRenderedPageBreak/>
         <w:t xml:space="preserve">Tabla 3. </w:t>
       </w:r>
       <w:r>
@@ -4002,255 +3998,286 @@
         <w:t>Decisiones de selección preliminar y justificación</w:t>
       </w:r>
     </w:p>
-    <w:p>
-      <w:pPr>
-        <w:spacing w:after="0" w:line="240" w:lineRule="auto"/>
-        <w:jc w:val="center"/>
-      </w:pPr>
-      <w:r>
-        <w:rPr>
-          <w:noProof/>
-        </w:rPr>
-        <w:drawing>
-          <wp:inline distT="0" distB="0" distL="0" distR="0" wp14:anchorId="5A8EF1D8" wp14:editId="38E0D0EC">
-            <wp:extent cx="2194560" cy="1530500"/>
-            <wp:effectExtent l="0" t="0" r="0" b="0"/>
-            <wp:docPr id="3" name="Picture 3"/>
-            <wp:cNvGraphicFramePr>
-              <a:graphicFrameLocks xmlns:a="http://schemas.openxmlformats.org/drawingml/2006/main" noChangeAspect="1"/>
-            </wp:cNvGraphicFramePr>
-            <a:graphic xmlns:a="http://schemas.openxmlformats.org/drawingml/2006/main">
-              <a:graphicData uri="http://schemas.openxmlformats.org/drawingml/2006/picture">
-                <pic:pic xmlns:pic="http://schemas.openxmlformats.org/drawingml/2006/picture">
-                  <pic:nvPicPr>
-                    <pic:cNvPr id="0" name="f4_titanic_mutual_information.png"/>
-                    <pic:cNvPicPr/>
-                  </pic:nvPicPr>
-                  <pic:blipFill>
-                    <a:blip r:embed="rId10"/>
-                    <a:stretch>
-                      <a:fillRect/>
-                    </a:stretch>
-                  </pic:blipFill>
-                  <pic:spPr>
-                    <a:xfrm>
-                      <a:off x="0" y="0"/>
-                      <a:ext cx="2194560" cy="1530500"/>
-                    </a:xfrm>
-                    <a:prstGeom prst="rect">
-                      <a:avLst/>
-                    </a:prstGeom>
-                  </pic:spPr>
-                </pic:pic>
-              </a:graphicData>
-            </a:graphic>
-          </wp:inline>
-        </w:drawing>
-      </w:r>
-    </w:p>
-    <w:p>
-      <w:pPr>
-        <w:keepNext/>
-        <w:spacing w:before="80" w:after="40" w:line="240" w:lineRule="auto"/>
-        <w:ind w:left="720" w:hanging="720"/>
-        <w:jc w:val="center"/>
-        <w:rPr>
-          <w:lang w:val="es-CL"/>
-        </w:rPr>
-      </w:pPr>
-      <w:r>
-        <w:rPr>
-          <w:b/>
-          <w:sz w:val="19"/>
-          <w:lang w:val="es-CL"/>
-        </w:rPr>
-        <w:t xml:space="preserve">Figura 2. </w:t>
-      </w:r>
-      <w:r>
-        <w:rPr>
-          <w:i/>
-          <w:sz w:val="19"/>
-          <w:lang w:val="es-CL"/>
-        </w:rPr>
-        <w:t>Información mutua (</w:t>
-      </w:r>
-      <w:proofErr w:type="spellStart"/>
-      <w:r>
-        <w:rPr>
-          <w:i/>
-          <w:sz w:val="19"/>
-          <w:lang w:val="es-CL"/>
-        </w:rPr>
-        <w:t>nats</w:t>
-      </w:r>
-      <w:proofErr w:type="spellEnd"/>
-      <w:r>
-        <w:rPr>
-          <w:i/>
-          <w:sz w:val="19"/>
-          <w:lang w:val="es-CL"/>
-        </w:rPr>
-        <w:t xml:space="preserve">) de las variables candidatas frente a </w:t>
-      </w:r>
-      <w:proofErr w:type="spellStart"/>
-      <w:r>
-        <w:rPr>
-          <w:rFonts w:ascii="Consolas" w:eastAsia="Consolas" w:hAnsi="Consolas"/>
-          <w:i/>
-          <w:sz w:val="16"/>
-          <w:lang w:val="es-CL"/>
-        </w:rPr>
-        <w:t>Survived</w:t>
-      </w:r>
-      <w:proofErr w:type="spellEnd"/>
-      <w:r>
-        <w:rPr>
-          <w:i/>
-          <w:sz w:val="19"/>
-          <w:lang w:val="es-CL"/>
-        </w:rPr>
-        <w:t xml:space="preserve"> (semilla 42)</w:t>
-      </w:r>
-    </w:p>
-    <w:p>
-      <w:pPr>
-        <w:jc w:val="both"/>
-        <w:rPr>
-          <w:lang w:val="es-CL"/>
-        </w:rPr>
-      </w:pPr>
-      <w:r>
-        <w:rPr>
-          <w:lang w:val="es-CL"/>
-        </w:rPr>
-        <w:t xml:space="preserve">El ranking es estable en 21 semillas: </w:t>
-      </w:r>
-      <w:proofErr w:type="spellStart"/>
-      <w:r>
-        <w:rPr>
-          <w:rFonts w:ascii="Consolas" w:eastAsia="Consolas" w:hAnsi="Consolas"/>
-          <w:sz w:val="19"/>
-          <w:lang w:val="es-CL"/>
-        </w:rPr>
-        <w:t>Sex_Pclass</w:t>
-      </w:r>
-      <w:proofErr w:type="spellEnd"/>
-      <w:r>
-        <w:rPr>
-          <w:lang w:val="es-CL"/>
-        </w:rPr>
-        <w:t xml:space="preserve">, </w:t>
-      </w:r>
-      <w:proofErr w:type="spellStart"/>
-      <w:r>
-        <w:rPr>
-          <w:rFonts w:ascii="Consolas" w:eastAsia="Consolas" w:hAnsi="Consolas"/>
-          <w:sz w:val="19"/>
-          <w:lang w:val="es-CL"/>
-        </w:rPr>
-        <w:t>Title_agrupado</w:t>
-      </w:r>
-      <w:proofErr w:type="spellEnd"/>
-      <w:r>
-        <w:rPr>
-          <w:lang w:val="es-CL"/>
-        </w:rPr>
-        <w:t xml:space="preserve"> y </w:t>
-      </w:r>
-      <w:proofErr w:type="spellStart"/>
-      <w:r>
-        <w:rPr>
-          <w:rFonts w:ascii="Consolas" w:eastAsia="Consolas" w:hAnsi="Consolas"/>
-          <w:sz w:val="19"/>
-          <w:lang w:val="es-CL"/>
-        </w:rPr>
-        <w:t>Fare_per_person_log</w:t>
-      </w:r>
-      <w:proofErr w:type="spellEnd"/>
-      <w:r>
-        <w:rPr>
-          <w:lang w:val="es-CL"/>
-        </w:rPr>
-        <w:t xml:space="preserve"> son siempre las tres primeras, y </w:t>
-      </w:r>
-      <w:proofErr w:type="spellStart"/>
-      <w:r>
-        <w:rPr>
-          <w:rFonts w:ascii="Consolas" w:eastAsia="Consolas" w:hAnsi="Consolas"/>
-          <w:sz w:val="19"/>
-          <w:lang w:val="es-CL"/>
-        </w:rPr>
-        <w:t>AgeGroup</w:t>
-      </w:r>
-      <w:proofErr w:type="spellEnd"/>
-      <w:r>
-        <w:rPr>
-          <w:lang w:val="es-CL"/>
-        </w:rPr>
-        <w:t xml:space="preserve"> y </w:t>
-      </w:r>
-      <w:proofErr w:type="spellStart"/>
-      <w:r>
-        <w:rPr>
-          <w:rFonts w:ascii="Consolas" w:eastAsia="Consolas" w:hAnsi="Consolas"/>
-          <w:sz w:val="19"/>
-          <w:lang w:val="es-CL"/>
-        </w:rPr>
-        <w:t>Embarked_clean</w:t>
-      </w:r>
-      <w:proofErr w:type="spellEnd"/>
-      <w:r>
-        <w:rPr>
-          <w:lang w:val="es-CL"/>
-        </w:rPr>
-        <w:t xml:space="preserve"> las últimas. Solo las continuas (</w:t>
-      </w:r>
-      <w:proofErr w:type="spellStart"/>
-      <w:r>
-        <w:rPr>
-          <w:rFonts w:ascii="Consolas" w:eastAsia="Consolas" w:hAnsi="Consolas"/>
-          <w:sz w:val="19"/>
-          <w:lang w:val="es-CL"/>
-        </w:rPr>
-        <w:t>Fare_per_person_log</w:t>
-      </w:r>
-      <w:proofErr w:type="spellEnd"/>
-      <w:r>
-        <w:rPr>
-          <w:lang w:val="es-CL"/>
-        </w:rPr>
-        <w:t xml:space="preserve">: 0.092–0.122; </w:t>
-      </w:r>
-      <w:proofErr w:type="spellStart"/>
-      <w:r>
-        <w:rPr>
-          <w:rFonts w:ascii="Consolas" w:eastAsia="Consolas" w:hAnsi="Consolas"/>
-          <w:sz w:val="19"/>
-          <w:lang w:val="es-CL"/>
-        </w:rPr>
-        <w:t>Age_clean</w:t>
-      </w:r>
-      <w:proofErr w:type="spellEnd"/>
-      <w:r>
-        <w:rPr>
-          <w:lang w:val="es-CL"/>
-        </w:rPr>
-        <w:t xml:space="preserve">: 0.016–0.070) varían con la semilla; los conteos se tratan como discretos. Como la </w:t>
-      </w:r>
-      <w:r>
-        <w:rPr>
-          <w:i/>
-          <w:lang w:val="es-CL"/>
-        </w:rPr>
-        <w:t>MI</w:t>
-      </w:r>
-      <w:r>
-        <w:rPr>
-          <w:lang w:val="es-CL"/>
-        </w:rPr>
-        <w:t xml:space="preserve"> mezcla dos estimadores no comparables, se lee como orden aproximado y no decide sola los descartes.</w:t>
-      </w:r>
-    </w:p>
+    <w:tbl>
+      <w:tblPr>
+        <w:tblW w:w="0" w:type="auto"/>
+        <w:tblBorders>
+          <w:top w:val="nil"/>
+          <w:left w:val="nil"/>
+          <w:bottom w:val="nil"/>
+          <w:right w:val="nil"/>
+          <w:insideH w:val="nil"/>
+          <w:insideV w:val="nil"/>
+        </w:tblBorders>
+        <w:tblLayout w:type="fixed"/>
+        <w:tblLook w:val="04A0" w:firstRow="1" w:lastRow="0" w:firstColumn="1" w:lastColumn="0" w:noHBand="0" w:noVBand="1"/>
+      </w:tblPr>
+      <w:tblGrid>
+        <w:gridCol w:w="6408"/>
+        <w:gridCol w:w="2952"/>
+      </w:tblGrid>
+      <w:tr>
+        <w:tc>
+          <w:tcPr>
+            <w:tcW w:w="6408" w:type="dxa"/>
+          </w:tcPr>
+          <w:p>
+            <w:pPr>
+              <w:spacing w:after="0" w:line="240" w:lineRule="auto"/>
+              <w:jc w:val="center"/>
+            </w:pPr>
+            <w:r>
+              <w:rPr>
+                <w:noProof/>
+              </w:rPr>
+              <w:drawing>
+                <wp:inline distT="0" distB="0" distL="0" distR="0" wp14:anchorId="5A8EF1D8" wp14:editId="490CF900">
+                  <wp:extent cx="3660277" cy="2552700"/>
+                  <wp:effectExtent l="0" t="0" r="0" b="0"/>
+                  <wp:docPr id="3" name="Picture 3"/>
+                  <wp:cNvGraphicFramePr>
+                    <a:graphicFrameLocks xmlns:a="http://schemas.openxmlformats.org/drawingml/2006/main" noChangeAspect="1"/>
+                  </wp:cNvGraphicFramePr>
+                  <a:graphic xmlns:a="http://schemas.openxmlformats.org/drawingml/2006/main">
+                    <a:graphicData uri="http://schemas.openxmlformats.org/drawingml/2006/picture">
+                      <pic:pic xmlns:pic="http://schemas.openxmlformats.org/drawingml/2006/picture">
+                        <pic:nvPicPr>
+                          <pic:cNvPr id="0" name="f4_titanic_mutual_information.png"/>
+                          <pic:cNvPicPr/>
+                        </pic:nvPicPr>
+                        <pic:blipFill>
+                          <a:blip r:embed="rId10"/>
+                          <a:stretch>
+                            <a:fillRect/>
+                          </a:stretch>
+                        </pic:blipFill>
+                        <pic:spPr>
+                          <a:xfrm>
+                            <a:off x="0" y="0"/>
+                            <a:ext cx="3685376" cy="2570204"/>
+                          </a:xfrm>
+                          <a:prstGeom prst="rect">
+                            <a:avLst/>
+                          </a:prstGeom>
+                        </pic:spPr>
+                      </pic:pic>
+                    </a:graphicData>
+                  </a:graphic>
+                </wp:inline>
+              </w:drawing>
+            </w:r>
+          </w:p>
+          <w:p>
+            <w:pPr>
+              <w:keepNext/>
+              <w:spacing w:before="80" w:after="40" w:line="240" w:lineRule="auto"/>
+              <w:ind w:left="720" w:hanging="720"/>
+              <w:jc w:val="center"/>
+              <w:rPr>
+                <w:lang w:val="es-CL"/>
+              </w:rPr>
+            </w:pPr>
+            <w:r>
+              <w:rPr>
+                <w:b/>
+                <w:sz w:val="19"/>
+                <w:lang w:val="es-CL"/>
+              </w:rPr>
+              <w:t xml:space="preserve">Figura 2. </w:t>
+            </w:r>
+            <w:r>
+              <w:rPr>
+                <w:i/>
+                <w:sz w:val="19"/>
+                <w:lang w:val="es-CL"/>
+              </w:rPr>
+              <w:t>Información mutua (</w:t>
+            </w:r>
+            <w:proofErr w:type="spellStart"/>
+            <w:r>
+              <w:rPr>
+                <w:i/>
+                <w:sz w:val="19"/>
+                <w:lang w:val="es-CL"/>
+              </w:rPr>
+              <w:t>nats</w:t>
+            </w:r>
+            <w:proofErr w:type="spellEnd"/>
+            <w:r>
+              <w:rPr>
+                <w:i/>
+                <w:sz w:val="19"/>
+                <w:lang w:val="es-CL"/>
+              </w:rPr>
+              <w:t xml:space="preserve">) de las variables candidatas frente a </w:t>
+            </w:r>
+            <w:proofErr w:type="spellStart"/>
+            <w:r>
+              <w:rPr>
+                <w:rFonts w:ascii="Consolas" w:eastAsia="Consolas" w:hAnsi="Consolas"/>
+                <w:i/>
+                <w:sz w:val="16"/>
+                <w:lang w:val="es-CL"/>
+              </w:rPr>
+              <w:t>Survived</w:t>
+            </w:r>
+            <w:proofErr w:type="spellEnd"/>
+            <w:r>
+              <w:rPr>
+                <w:i/>
+                <w:sz w:val="19"/>
+                <w:lang w:val="es-CL"/>
+              </w:rPr>
+              <w:t xml:space="preserve"> (semilla 42)</w:t>
+            </w:r>
+          </w:p>
+        </w:tc>
+        <w:tc>
+          <w:tcPr>
+            <w:tcW w:w="2952" w:type="dxa"/>
+            <w:vAlign w:val="center"/>
+          </w:tcPr>
+          <w:p>
+            <w:pPr>
+              <w:rPr>
+                <w:lang w:val="es-CL"/>
+              </w:rPr>
+            </w:pPr>
+            <w:r>
+              <w:rPr>
+                <w:lang w:val="es-CL"/>
+              </w:rPr>
+              <w:t xml:space="preserve">El ranking es estable en 21 semillas: </w:t>
+            </w:r>
+            <w:proofErr w:type="spellStart"/>
+            <w:r>
+              <w:rPr>
+                <w:rFonts w:ascii="Consolas" w:eastAsia="Consolas" w:hAnsi="Consolas"/>
+                <w:sz w:val="19"/>
+                <w:lang w:val="es-CL"/>
+              </w:rPr>
+              <w:t>Sex_Pclass</w:t>
+            </w:r>
+            <w:proofErr w:type="spellEnd"/>
+            <w:r>
+              <w:rPr>
+                <w:lang w:val="es-CL"/>
+              </w:rPr>
+              <w:t xml:space="preserve">, </w:t>
+            </w:r>
+            <w:proofErr w:type="spellStart"/>
+            <w:r>
+              <w:rPr>
+                <w:rFonts w:ascii="Consolas" w:eastAsia="Consolas" w:hAnsi="Consolas"/>
+                <w:sz w:val="19"/>
+                <w:lang w:val="es-CL"/>
+              </w:rPr>
+              <w:t>Title_agrupado</w:t>
+            </w:r>
+            <w:proofErr w:type="spellEnd"/>
+            <w:r>
+              <w:rPr>
+                <w:lang w:val="es-CL"/>
+              </w:rPr>
+              <w:t xml:space="preserve"> y </w:t>
+            </w:r>
+            <w:proofErr w:type="spellStart"/>
+            <w:r>
+              <w:rPr>
+                <w:rFonts w:ascii="Consolas" w:eastAsia="Consolas" w:hAnsi="Consolas"/>
+                <w:sz w:val="19"/>
+                <w:lang w:val="es-CL"/>
+              </w:rPr>
+              <w:t>Fare_per_person_log</w:t>
+            </w:r>
+            <w:proofErr w:type="spellEnd"/>
+            <w:r>
+              <w:rPr>
+                <w:lang w:val="es-CL"/>
+              </w:rPr>
+              <w:t xml:space="preserve"> siempre encabezan, y </w:t>
+            </w:r>
+            <w:proofErr w:type="spellStart"/>
+            <w:r>
+              <w:rPr>
+                <w:rFonts w:ascii="Consolas" w:eastAsia="Consolas" w:hAnsi="Consolas"/>
+                <w:sz w:val="19"/>
+                <w:lang w:val="es-CL"/>
+              </w:rPr>
+              <w:t>AgeGroup</w:t>
+            </w:r>
+            <w:proofErr w:type="spellEnd"/>
+            <w:r>
+              <w:rPr>
+                <w:lang w:val="es-CL"/>
+              </w:rPr>
+              <w:t xml:space="preserve"> y </w:t>
+            </w:r>
+            <w:proofErr w:type="spellStart"/>
+            <w:r>
+              <w:rPr>
+                <w:rFonts w:ascii="Consolas" w:eastAsia="Consolas" w:hAnsi="Consolas"/>
+                <w:sz w:val="19"/>
+                <w:lang w:val="es-CL"/>
+              </w:rPr>
+              <w:t>Embarked_clean</w:t>
+            </w:r>
+            <w:proofErr w:type="spellEnd"/>
+            <w:r>
+              <w:rPr>
+                <w:lang w:val="es-CL"/>
+              </w:rPr>
+              <w:t xml:space="preserve"> cierran; solo varían las continuas (</w:t>
+            </w:r>
+            <w:proofErr w:type="spellStart"/>
+            <w:r>
+              <w:rPr>
+                <w:rFonts w:ascii="Consolas" w:eastAsia="Consolas" w:hAnsi="Consolas"/>
+                <w:sz w:val="19"/>
+                <w:lang w:val="es-CL"/>
+              </w:rPr>
+              <w:t>Fare_per_person_log</w:t>
+            </w:r>
+            <w:proofErr w:type="spellEnd"/>
+            <w:r>
+              <w:rPr>
+                <w:lang w:val="es-CL"/>
+              </w:rPr>
+              <w:t xml:space="preserve">: 0.092–0.122; </w:t>
+            </w:r>
+            <w:proofErr w:type="spellStart"/>
+            <w:r>
+              <w:rPr>
+                <w:rFonts w:ascii="Consolas" w:eastAsia="Consolas" w:hAnsi="Consolas"/>
+                <w:sz w:val="19"/>
+                <w:lang w:val="es-CL"/>
+              </w:rPr>
+              <w:t>Age_clean</w:t>
+            </w:r>
+            <w:proofErr w:type="spellEnd"/>
+            <w:r>
+              <w:rPr>
+                <w:lang w:val="es-CL"/>
+              </w:rPr>
+              <w:t xml:space="preserve">: 0.016–0.070). Como la </w:t>
+            </w:r>
+            <w:r>
+              <w:rPr>
+                <w:i/>
+                <w:lang w:val="es-CL"/>
+              </w:rPr>
+              <w:t>MI</w:t>
+            </w:r>
+            <w:r>
+              <w:rPr>
+                <w:lang w:val="es-CL"/>
+              </w:rPr>
+              <w:t xml:space="preserve"> mezcla dos estimadores no comparables, se lee como orden aproximado y no decide sola los descartes.</w:t>
+            </w:r>
+          </w:p>
+        </w:tc>
+      </w:tr>
+    </w:tbl>
     <w:p>
       <w:pPr>
         <w:pStyle w:val="Ttulo1"/>
@@ -4291,7 +4318,21 @@
         <w:rPr>
           <w:lang w:val="es-CL"/>
         </w:rPr>
-        <w:t>El notebook está ejecutado de punta a punta, con rutas relativas, semilla fija (</w:t>
+        <w:t xml:space="preserve">El notebook está ejecutado de punta a punta; lee los datos desde sus fuentes públicas (Data </w:t>
+      </w:r>
+      <w:proofErr w:type="spellStart"/>
+      <w:r>
+        <w:rPr>
+          <w:lang w:val="es-CL"/>
+        </w:rPr>
+        <w:t>Science</w:t>
+      </w:r>
+      <w:proofErr w:type="spellEnd"/>
+      <w:r>
+        <w:rPr>
+          <w:lang w:val="es-CL"/>
+        </w:rPr>
+        <w:t xml:space="preserve"> Dojo, s. f.; Waskom, s. f.), verifica las versiones mínimas de </w:t>
       </w:r>
       <w:r>
         <w:rPr>
@@ -4299,13 +4340,13 @@
           <w:sz w:val="19"/>
           <w:lang w:val="es-CL"/>
         </w:rPr>
-        <w:t>RANDOM_STATE = 42</w:t>
-      </w:r>
-      <w:r>
-        <w:rPr>
-          <w:lang w:val="es-CL"/>
-        </w:rPr>
-        <w:t xml:space="preserve">) y </w:t>
+        <w:t>requirements.txt</w:t>
+      </w:r>
+      <w:r>
+        <w:rPr>
+          <w:lang w:val="es-CL"/>
+        </w:rPr>
+        <w:t xml:space="preserve"> antes de ejecutar (NB §II.1) y usa semilla fija (</w:t>
       </w:r>
       <w:r>
         <w:rPr>
@@ -4313,13 +4354,13 @@
           <w:sz w:val="19"/>
           <w:lang w:val="es-CL"/>
         </w:rPr>
-        <w:t>requirements.txt</w:t>
-      </w:r>
-      <w:r>
-        <w:rPr>
-          <w:lang w:val="es-CL"/>
-        </w:rPr>
-        <w:t xml:space="preserve">. Cada acción queda en una bitácora de 10 pasos (NB §VII), las decisiones en NB §VI.4 (cifras calculadas en el notebook) y el destino de las 36 columnas en NB §VI.5. Se usaron pandas (McKinney, 2010), </w:t>
+        <w:t>RANDOM_STATE = 42</w:t>
+      </w:r>
+      <w:r>
+        <w:rPr>
+          <w:lang w:val="es-CL"/>
+        </w:rPr>
+        <w:t xml:space="preserve">). Cada acción queda en una bitácora de 10 pasos (NB §VII), las decisiones en NB §VI.4 (cifras calculadas en el notebook) y el destino de las 36 columnas en NB §VI.5. Se usaron pandas (McKinney, 2010), </w:t>
       </w:r>
       <w:proofErr w:type="spellStart"/>
       <w:r>
@@ -4420,7 +4461,6 @@
       </w:tblGrid>
       <w:tr>
         <w:trPr>
-          <w:cantSplit/>
           <w:tblHeader/>
           <w:jc w:val="center"/>
         </w:trPr>
@@ -4484,7 +4524,6 @@
       </w:tr>
       <w:tr>
         <w:trPr>
-          <w:cantSplit/>
           <w:jc w:val="center"/>
         </w:trPr>
         <w:tc>
@@ -4538,28 +4577,120 @@
                 <w:sz w:val="18"/>
                 <w:lang w:val="es-CL"/>
               </w:rPr>
-              <w:t xml:space="preserve">I. Encabezado; II. Carga; III. </w:t>
+              <w:t>I–III. Encabezado, carga y revisión</w:t>
+            </w:r>
+          </w:p>
+        </w:tc>
+        <w:tc>
+          <w:tcPr>
+            <w:tcW w:w="2880" w:type="dxa"/>
+          </w:tcPr>
+          <w:p>
+            <w:pPr>
+              <w:spacing w:after="0" w:line="240" w:lineRule="auto"/>
+            </w:pPr>
+            <w:r>
+              <w:rPr>
+                <w:sz w:val="18"/>
+                <w:lang w:val="es-CL"/>
+              </w:rPr>
+              <w:t xml:space="preserve">I–III. Problema, </w:t>
             </w:r>
             <w:proofErr w:type="spellStart"/>
             <w:r>
               <w:rPr>
                 <w:sz w:val="18"/>
-              </w:rPr>
-              <w:t>Revisión</w:t>
+                <w:lang w:val="es-CL"/>
+              </w:rPr>
+              <w:t>dataset</w:t>
             </w:r>
             <w:proofErr w:type="spellEnd"/>
             <w:r>
               <w:rPr>
                 <w:sz w:val="18"/>
-              </w:rPr>
-              <w:t xml:space="preserve"> </w:t>
+                <w:lang w:val="es-CL"/>
+              </w:rPr>
+              <w:t xml:space="preserve"> y hallazgos</w:t>
+            </w:r>
+          </w:p>
+        </w:tc>
+      </w:tr>
+      <w:tr>
+        <w:trPr>
+          <w:jc w:val="center"/>
+        </w:trPr>
+        <w:tc>
+          <w:tcPr>
+            <w:tcW w:w="3024" w:type="dxa"/>
+          </w:tcPr>
+          <w:p>
+            <w:pPr>
+              <w:spacing w:after="0" w:line="240" w:lineRule="auto"/>
+            </w:pPr>
+            <w:r>
+              <w:rPr>
+                <w:sz w:val="18"/>
+              </w:rPr>
+              <w:t xml:space="preserve">III–IV. </w:t>
             </w:r>
             <w:proofErr w:type="spellStart"/>
             <w:r>
               <w:rPr>
                 <w:sz w:val="18"/>
               </w:rPr>
-              <w:t>inicial</w:t>
+              <w:t>Transformaciones</w:t>
+            </w:r>
+            <w:proofErr w:type="spellEnd"/>
+            <w:r>
+              <w:rPr>
+                <w:sz w:val="18"/>
+              </w:rPr>
+              <w:t xml:space="preserve"> y </w:t>
+            </w:r>
+            <w:proofErr w:type="spellStart"/>
+            <w:r>
+              <w:rPr>
+                <w:sz w:val="18"/>
+              </w:rPr>
+              <w:t>derivadas</w:t>
+            </w:r>
+            <w:proofErr w:type="spellEnd"/>
+          </w:p>
+        </w:tc>
+        <w:tc>
+          <w:tcPr>
+            <w:tcW w:w="3456" w:type="dxa"/>
+          </w:tcPr>
+          <w:p>
+            <w:pPr>
+              <w:spacing w:after="0" w:line="240" w:lineRule="auto"/>
+            </w:pPr>
+            <w:r>
+              <w:rPr>
+                <w:sz w:val="18"/>
+              </w:rPr>
+              <w:t xml:space="preserve">IV–V. </w:t>
+            </w:r>
+            <w:proofErr w:type="spellStart"/>
+            <w:r>
+              <w:rPr>
+                <w:sz w:val="18"/>
+              </w:rPr>
+              <w:t>Transformaciones</w:t>
+            </w:r>
+            <w:proofErr w:type="spellEnd"/>
+            <w:r>
+              <w:rPr>
+                <w:sz w:val="18"/>
+              </w:rPr>
+              <w:t xml:space="preserve"> y </w:t>
+            </w:r>
+            <w:proofErr w:type="spellStart"/>
+            <w:r>
+              <w:rPr>
+                <w:sz w:val="18"/>
+              </w:rPr>
+              <w:t>derivadas</w:t>
             </w:r>
             <w:proofErr w:type="spellEnd"/>
           </w:p>
@@ -4575,32 +4706,29 @@
             <w:r>
               <w:rPr>
                 <w:sz w:val="18"/>
-                <w:lang w:val="es-CL"/>
-              </w:rPr>
-              <w:t xml:space="preserve">I. Problema; II. </w:t>
+              </w:rPr>
+              <w:t xml:space="preserve">IV. </w:t>
             </w:r>
             <w:proofErr w:type="spellStart"/>
             <w:r>
               <w:rPr>
                 <w:sz w:val="18"/>
-                <w:lang w:val="es-CL"/>
-              </w:rPr>
-              <w:t>Dataset</w:t>
+              </w:rPr>
+              <w:t>Transformaciones</w:t>
             </w:r>
             <w:proofErr w:type="spellEnd"/>
             <w:r>
               <w:rPr>
                 <w:sz w:val="18"/>
-                <w:lang w:val="es-CL"/>
-              </w:rPr>
-              <w:t xml:space="preserve"> y recorrido; III. </w:t>
+              </w:rPr>
+              <w:t xml:space="preserve"> y </w:t>
             </w:r>
             <w:proofErr w:type="spellStart"/>
             <w:r>
               <w:rPr>
                 <w:sz w:val="18"/>
               </w:rPr>
-              <w:t>Hallazgos</w:t>
+              <w:t>derivadas</w:t>
             </w:r>
             <w:proofErr w:type="spellEnd"/>
           </w:p>
@@ -4608,7 +4736,6 @@
       </w:tr>
       <w:tr>
         <w:trPr>
-          <w:cantSplit/>
           <w:jc w:val="center"/>
         </w:trPr>
         <w:tc>
@@ -4623,14 +4750,28 @@
               <w:rPr>
                 <w:sz w:val="18"/>
               </w:rPr>
-              <w:t xml:space="preserve">III. </w:t>
+              <w:t xml:space="preserve">V. </w:t>
             </w:r>
             <w:proofErr w:type="spellStart"/>
             <w:r>
               <w:rPr>
                 <w:sz w:val="18"/>
               </w:rPr>
-              <w:t>Transformaciones</w:t>
+              <w:t>Selección</w:t>
+            </w:r>
+            <w:proofErr w:type="spellEnd"/>
+            <w:r>
+              <w:rPr>
+                <w:sz w:val="18"/>
+              </w:rPr>
+              <w:t xml:space="preserve"> de </w:t>
+            </w:r>
+            <w:proofErr w:type="spellStart"/>
+            <w:r>
+              <w:rPr>
+                <w:sz w:val="18"/>
+              </w:rPr>
+              <w:t>características</w:t>
             </w:r>
             <w:proofErr w:type="spellEnd"/>
           </w:p>
@@ -4647,28 +4788,28 @@
               <w:rPr>
                 <w:sz w:val="18"/>
               </w:rPr>
-              <w:t xml:space="preserve">IV. </w:t>
+              <w:t xml:space="preserve">VI. </w:t>
             </w:r>
             <w:proofErr w:type="spellStart"/>
             <w:r>
               <w:rPr>
                 <w:sz w:val="18"/>
               </w:rPr>
-              <w:t>Transformaciones</w:t>
+              <w:t>Selección</w:t>
             </w:r>
             <w:proofErr w:type="spellEnd"/>
             <w:r>
               <w:rPr>
                 <w:sz w:val="18"/>
               </w:rPr>
-              <w:t xml:space="preserve"> y </w:t>
+              <w:t xml:space="preserve"> </w:t>
             </w:r>
             <w:proofErr w:type="spellStart"/>
             <w:r>
               <w:rPr>
                 <w:sz w:val="18"/>
               </w:rPr>
-              <w:t>normalizaciones</w:t>
+              <w:t>preliminar</w:t>
             </w:r>
             <w:proofErr w:type="spellEnd"/>
           </w:p>
@@ -4685,28 +4826,28 @@
               <w:rPr>
                 <w:sz w:val="18"/>
               </w:rPr>
-              <w:t xml:space="preserve">IV. </w:t>
+              <w:t xml:space="preserve">V. </w:t>
             </w:r>
             <w:proofErr w:type="spellStart"/>
             <w:r>
               <w:rPr>
                 <w:sz w:val="18"/>
               </w:rPr>
-              <w:t>Transformaciones</w:t>
+              <w:t>Selección</w:t>
             </w:r>
             <w:proofErr w:type="spellEnd"/>
             <w:r>
               <w:rPr>
                 <w:sz w:val="18"/>
               </w:rPr>
-              <w:t xml:space="preserve"> y </w:t>
+              <w:t xml:space="preserve"> </w:t>
             </w:r>
             <w:proofErr w:type="spellStart"/>
             <w:r>
               <w:rPr>
                 <w:sz w:val="18"/>
               </w:rPr>
-              <w:t>derivadas</w:t>
+              <w:t>preliminar</w:t>
             </w:r>
             <w:proofErr w:type="spellEnd"/>
           </w:p>
@@ -4714,7 +4855,6 @@
       </w:tr>
       <w:tr>
         <w:trPr>
-          <w:cantSplit/>
           <w:jc w:val="center"/>
         </w:trPr>
         <w:tc>
@@ -4729,14 +4869,14 @@
               <w:rPr>
                 <w:sz w:val="18"/>
               </w:rPr>
-              <w:t xml:space="preserve">IV. Variables </w:t>
+              <w:t xml:space="preserve">VI. </w:t>
             </w:r>
             <w:proofErr w:type="spellStart"/>
             <w:r>
               <w:rPr>
                 <w:sz w:val="18"/>
               </w:rPr>
-              <w:t>derivadas</w:t>
+              <w:t>Documentación</w:t>
             </w:r>
             <w:proofErr w:type="spellEnd"/>
           </w:p>
@@ -4753,14 +4893,28 @@
               <w:rPr>
                 <w:sz w:val="18"/>
               </w:rPr>
-              <w:t xml:space="preserve">V. Variables </w:t>
+              <w:t xml:space="preserve">VII. </w:t>
             </w:r>
             <w:proofErr w:type="spellStart"/>
             <w:r>
               <w:rPr>
                 <w:sz w:val="18"/>
               </w:rPr>
-              <w:t>derivadas</w:t>
+              <w:t>Documentación</w:t>
+            </w:r>
+            <w:proofErr w:type="spellEnd"/>
+            <w:r>
+              <w:rPr>
+                <w:sz w:val="18"/>
+              </w:rPr>
+              <w:t xml:space="preserve"> y </w:t>
+            </w:r>
+            <w:proofErr w:type="spellStart"/>
+            <w:r>
+              <w:rPr>
+                <w:sz w:val="18"/>
+              </w:rPr>
+              <w:t>trazabilidad</w:t>
             </w:r>
             <w:proofErr w:type="spellEnd"/>
           </w:p>
@@ -4777,36 +4931,13 @@
               <w:rPr>
                 <w:sz w:val="18"/>
               </w:rPr>
-              <w:t xml:space="preserve">IV. </w:t>
-            </w:r>
-            <w:proofErr w:type="spellStart"/>
-            <w:r>
-              <w:rPr>
-                <w:sz w:val="18"/>
-              </w:rPr>
-              <w:t>Transformaciones</w:t>
-            </w:r>
-            <w:proofErr w:type="spellEnd"/>
-            <w:r>
-              <w:rPr>
-                <w:sz w:val="18"/>
-              </w:rPr>
-              <w:t xml:space="preserve"> y </w:t>
-            </w:r>
-            <w:proofErr w:type="spellStart"/>
-            <w:r>
-              <w:rPr>
-                <w:sz w:val="18"/>
-              </w:rPr>
-              <w:t>derivadas</w:t>
-            </w:r>
-            <w:proofErr w:type="spellEnd"/>
+              <w:t>Transversal</w:t>
+            </w:r>
           </w:p>
         </w:tc>
       </w:tr>
       <w:tr>
         <w:trPr>
-          <w:cantSplit/>
           <w:jc w:val="center"/>
         </w:trPr>
         <w:tc>
@@ -4821,28 +4952,14 @@
               <w:rPr>
                 <w:sz w:val="18"/>
               </w:rPr>
-              <w:t xml:space="preserve">V. </w:t>
+              <w:t xml:space="preserve">VII. </w:t>
             </w:r>
             <w:proofErr w:type="spellStart"/>
             <w:r>
               <w:rPr>
                 <w:sz w:val="18"/>
               </w:rPr>
-              <w:t>Selección</w:t>
-            </w:r>
-            <w:proofErr w:type="spellEnd"/>
-            <w:r>
-              <w:rPr>
-                <w:sz w:val="18"/>
-              </w:rPr>
-              <w:t xml:space="preserve"> de </w:t>
-            </w:r>
-            <w:proofErr w:type="spellStart"/>
-            <w:r>
-              <w:rPr>
-                <w:sz w:val="18"/>
-              </w:rPr>
-              <w:t>características</w:t>
+              <w:t>Resultados</w:t>
             </w:r>
             <w:proofErr w:type="spellEnd"/>
           </w:p>
@@ -4854,33 +4971,24 @@
           <w:p>
             <w:pPr>
               <w:spacing w:after="0" w:line="240" w:lineRule="auto"/>
+              <w:rPr>
+                <w:lang w:val="es-CL"/>
+              </w:rPr>
             </w:pPr>
             <w:r>
               <w:rPr>
                 <w:sz w:val="18"/>
-              </w:rPr>
-              <w:t xml:space="preserve">VI. </w:t>
+                <w:lang w:val="es-CL"/>
+              </w:rPr>
+              <w:t xml:space="preserve">VIII. Resultado final del </w:t>
             </w:r>
             <w:proofErr w:type="spellStart"/>
             <w:r>
               <w:rPr>
                 <w:sz w:val="18"/>
-              </w:rPr>
-              <w:t>Selección</w:t>
-            </w:r>
-            <w:proofErr w:type="spellEnd"/>
-            <w:r>
-              <w:rPr>
-                <w:sz w:val="18"/>
-              </w:rPr>
-              <w:t xml:space="preserve"> </w:t>
-            </w:r>
-            <w:proofErr w:type="spellStart"/>
-            <w:r>
-              <w:rPr>
-                <w:sz w:val="18"/>
-              </w:rPr>
-              <w:t>preliminar</w:t>
+                <w:lang w:val="es-CL"/>
+              </w:rPr>
+              <w:t>dataset</w:t>
             </w:r>
             <w:proofErr w:type="spellEnd"/>
           </w:p>
@@ -4892,41 +5000,22 @@
           <w:p>
             <w:pPr>
               <w:spacing w:after="0" w:line="240" w:lineRule="auto"/>
+              <w:rPr>
+                <w:lang w:val="es-CL"/>
+              </w:rPr>
             </w:pPr>
             <w:r>
               <w:rPr>
                 <w:sz w:val="18"/>
-              </w:rPr>
-              <w:t xml:space="preserve">V. </w:t>
-            </w:r>
-            <w:proofErr w:type="spellStart"/>
-            <w:r>
-              <w:rPr>
-                <w:sz w:val="18"/>
-              </w:rPr>
-              <w:t>Selección</w:t>
-            </w:r>
-            <w:proofErr w:type="spellEnd"/>
-            <w:r>
-              <w:rPr>
-                <w:sz w:val="18"/>
-              </w:rPr>
-              <w:t xml:space="preserve"> </w:t>
-            </w:r>
-            <w:proofErr w:type="spellStart"/>
-            <w:r>
-              <w:rPr>
-                <w:sz w:val="18"/>
-              </w:rPr>
-              <w:t>preliminar</w:t>
-            </w:r>
-            <w:proofErr w:type="spellEnd"/>
+                <w:lang w:val="es-CL"/>
+              </w:rPr>
+              <w:t>VI. Valor analítico del cierre</w:t>
+            </w:r>
           </w:p>
         </w:tc>
       </w:tr>
       <w:tr>
         <w:trPr>
-          <w:cantSplit/>
           <w:jc w:val="center"/>
         </w:trPr>
         <w:tc>
@@ -4941,14 +5030,28 @@
               <w:rPr>
                 <w:sz w:val="18"/>
               </w:rPr>
-              <w:t xml:space="preserve">VI. </w:t>
+              <w:t xml:space="preserve">VIII. </w:t>
             </w:r>
             <w:proofErr w:type="spellStart"/>
             <w:r>
               <w:rPr>
                 <w:sz w:val="18"/>
               </w:rPr>
-              <w:t>Documentación</w:t>
+              <w:t>Decisiones</w:t>
+            </w:r>
+            <w:proofErr w:type="spellEnd"/>
+            <w:r>
+              <w:rPr>
+                <w:sz w:val="18"/>
+              </w:rPr>
+              <w:t xml:space="preserve"> y </w:t>
+            </w:r>
+            <w:proofErr w:type="spellStart"/>
+            <w:r>
+              <w:rPr>
+                <w:sz w:val="18"/>
+              </w:rPr>
+              <w:t>limitaciones</w:t>
             </w:r>
             <w:proofErr w:type="spellEnd"/>
           </w:p>
@@ -4960,35 +5063,17 @@
           <w:p>
             <w:pPr>
               <w:spacing w:after="0" w:line="240" w:lineRule="auto"/>
+              <w:rPr>
+                <w:lang w:val="es-CL"/>
+              </w:rPr>
             </w:pPr>
             <w:r>
               <w:rPr>
                 <w:sz w:val="18"/>
-              </w:rPr>
-              <w:t xml:space="preserve">VII. </w:t>
-            </w:r>
-            <w:proofErr w:type="spellStart"/>
-            <w:r>
-              <w:rPr>
-                <w:sz w:val="18"/>
-              </w:rPr>
-              <w:t>Documentación</w:t>
-            </w:r>
-            <w:proofErr w:type="spellEnd"/>
-            <w:r>
-              <w:rPr>
-                <w:sz w:val="18"/>
-              </w:rPr>
-              <w:t xml:space="preserve"> y </w:t>
-            </w:r>
-            <w:proofErr w:type="spellStart"/>
-            <w:r>
-              <w:rPr>
-                <w:sz w:val="18"/>
-              </w:rPr>
-              <w:t>trazabilidad</w:t>
-            </w:r>
-            <w:proofErr w:type="spellEnd"/>
+                <w:lang w:val="es-CL"/>
+              </w:rPr>
+              <w:t>IX. Supuestos, limitaciones y cierre</w:t>
+            </w:r>
           </w:p>
         </w:tc>
         <w:tc>
@@ -4998,165 +5083,6 @@
           <w:p>
             <w:pPr>
               <w:spacing w:after="0" w:line="240" w:lineRule="auto"/>
-            </w:pPr>
-            <w:r>
-              <w:rPr>
-                <w:sz w:val="18"/>
-              </w:rPr>
-              <w:t>Transversal</w:t>
-            </w:r>
-          </w:p>
-        </w:tc>
-      </w:tr>
-      <w:tr>
-        <w:trPr>
-          <w:cantSplit/>
-          <w:jc w:val="center"/>
-        </w:trPr>
-        <w:tc>
-          <w:tcPr>
-            <w:tcW w:w="3024" w:type="dxa"/>
-          </w:tcPr>
-          <w:p>
-            <w:pPr>
-              <w:spacing w:after="0" w:line="240" w:lineRule="auto"/>
-            </w:pPr>
-            <w:r>
-              <w:rPr>
-                <w:sz w:val="18"/>
-              </w:rPr>
-              <w:t xml:space="preserve">VII. </w:t>
-            </w:r>
-            <w:proofErr w:type="spellStart"/>
-            <w:r>
-              <w:rPr>
-                <w:sz w:val="18"/>
-              </w:rPr>
-              <w:t>Resultados</w:t>
-            </w:r>
-            <w:proofErr w:type="spellEnd"/>
-          </w:p>
-        </w:tc>
-        <w:tc>
-          <w:tcPr>
-            <w:tcW w:w="3456" w:type="dxa"/>
-          </w:tcPr>
-          <w:p>
-            <w:pPr>
-              <w:spacing w:after="0" w:line="240" w:lineRule="auto"/>
-              <w:rPr>
-                <w:lang w:val="es-CL"/>
-              </w:rPr>
-            </w:pPr>
-            <w:r>
-              <w:rPr>
-                <w:sz w:val="18"/>
-                <w:lang w:val="es-CL"/>
-              </w:rPr>
-              <w:t xml:space="preserve">VIII. Resultado final del </w:t>
-            </w:r>
-            <w:proofErr w:type="spellStart"/>
-            <w:r>
-              <w:rPr>
-                <w:sz w:val="18"/>
-                <w:lang w:val="es-CL"/>
-              </w:rPr>
-              <w:t>dataset</w:t>
-            </w:r>
-            <w:proofErr w:type="spellEnd"/>
-          </w:p>
-        </w:tc>
-        <w:tc>
-          <w:tcPr>
-            <w:tcW w:w="2880" w:type="dxa"/>
-          </w:tcPr>
-          <w:p>
-            <w:pPr>
-              <w:spacing w:after="0" w:line="240" w:lineRule="auto"/>
-              <w:rPr>
-                <w:lang w:val="es-CL"/>
-              </w:rPr>
-            </w:pPr>
-            <w:r>
-              <w:rPr>
-                <w:sz w:val="18"/>
-                <w:lang w:val="es-CL"/>
-              </w:rPr>
-              <w:t>VI. Valor analítico del cierre</w:t>
-            </w:r>
-          </w:p>
-        </w:tc>
-      </w:tr>
-      <w:tr>
-        <w:trPr>
-          <w:cantSplit/>
-          <w:jc w:val="center"/>
-        </w:trPr>
-        <w:tc>
-          <w:tcPr>
-            <w:tcW w:w="3024" w:type="dxa"/>
-          </w:tcPr>
-          <w:p>
-            <w:pPr>
-              <w:spacing w:after="0" w:line="240" w:lineRule="auto"/>
-            </w:pPr>
-            <w:r>
-              <w:rPr>
-                <w:sz w:val="18"/>
-              </w:rPr>
-              <w:t xml:space="preserve">VIII. </w:t>
-            </w:r>
-            <w:proofErr w:type="spellStart"/>
-            <w:r>
-              <w:rPr>
-                <w:sz w:val="18"/>
-              </w:rPr>
-              <w:t>Decisiones</w:t>
-            </w:r>
-            <w:proofErr w:type="spellEnd"/>
-            <w:r>
-              <w:rPr>
-                <w:sz w:val="18"/>
-              </w:rPr>
-              <w:t xml:space="preserve"> y </w:t>
-            </w:r>
-            <w:proofErr w:type="spellStart"/>
-            <w:r>
-              <w:rPr>
-                <w:sz w:val="18"/>
-              </w:rPr>
-              <w:t>limitaciones</w:t>
-            </w:r>
-            <w:proofErr w:type="spellEnd"/>
-          </w:p>
-        </w:tc>
-        <w:tc>
-          <w:tcPr>
-            <w:tcW w:w="3456" w:type="dxa"/>
-          </w:tcPr>
-          <w:p>
-            <w:pPr>
-              <w:spacing w:after="0" w:line="240" w:lineRule="auto"/>
-              <w:rPr>
-                <w:lang w:val="es-CL"/>
-              </w:rPr>
-            </w:pPr>
-            <w:r>
-              <w:rPr>
-                <w:sz w:val="18"/>
-                <w:lang w:val="es-CL"/>
-              </w:rPr>
-              <w:t>IX. Supuestos, limitaciones y cierre</w:t>
-            </w:r>
-          </w:p>
-        </w:tc>
-        <w:tc>
-          <w:tcPr>
-            <w:tcW w:w="2880" w:type="dxa"/>
-          </w:tcPr>
-          <w:p>
-            <w:pPr>
-              <w:spacing w:after="0" w:line="240" w:lineRule="auto"/>
               <w:rPr>
                 <w:lang w:val="es-CL"/>
               </w:rPr>
@@ -5187,7 +5113,6 @@
           <w:sz w:val="19"/>
           <w:lang w:val="es-CL"/>
         </w:rPr>
-        <w:lastRenderedPageBreak/>
         <w:t xml:space="preserve">Tabla 4. </w:t>
       </w:r>
       <w:r>
@@ -5232,7 +5157,7 @@
         <w:rPr>
           <w:lang w:val="es-CL"/>
         </w:rPr>
-        <w:t xml:space="preserve"> Escalado robusto de variables con colas legítimas, dos variables derivadas con evidencia cuantitativa, eliminación de redundancias exactas y codificación </w:t>
+        <w:t xml:space="preserve"> Escalado robusto, dos variables derivadas validadas, eliminación de redundancias exactas y codificación </w:t>
       </w:r>
       <w:r>
         <w:rPr>
@@ -5324,7 +5249,21 @@
         <w:rPr>
           <w:lang w:val="es-CL"/>
         </w:rPr>
-        <w:t>): las 36 columnas disponibles (32 más 4 nuevas) tienen destino documentado, sin valores faltantes ni colinealidad exacta.</w:t>
+        <w:t xml:space="preserve">): las 36 columnas disponibles tienen destino documentado (NB §VI.5): 14 se descartan según la Tabla 3 (12 por redundancia) y 4 se sustituyeron en las Fases 2-3 (Name, Age, Cabin, </w:t>
+      </w:r>
+      <w:proofErr w:type="spellStart"/>
+      <w:r>
+        <w:rPr>
+          <w:lang w:val="es-CL"/>
+        </w:rPr>
+        <w:t>Embarked</w:t>
+      </w:r>
+      <w:proofErr w:type="spellEnd"/>
+      <w:r>
+        <w:rPr>
+          <w:lang w:val="es-CL"/>
+        </w:rPr>
+        <w:t>). Sin faltantes ni colinealidad exacta (rango completo, 28 de 28).</w:t>
       </w:r>
     </w:p>
     <w:p>
@@ -5337,13 +5276,14 @@
           <w:b/>
           <w:lang w:val="es-CL"/>
         </w:rPr>
+        <w:lastRenderedPageBreak/>
         <w:t>Valor para el modelamiento.</w:t>
       </w:r>
       <w:r>
         <w:rPr>
           <w:lang w:val="es-CL"/>
         </w:rPr>
-        <w:t xml:space="preserve"> El conjunto está codificado y escalado, con pocas variables justificadas, sin fuga ni colinealidad exacta. La señal dominante (sexo × clase, título, tarifa por persona) sugiere como referencia regresión logística regularizada o árboles; </w:t>
+        <w:t xml:space="preserve"> La señal dominante (sexo × clase, título, tarifa por persona) sugiere como referencia regresión logística regularizada o árboles; </w:t>
       </w:r>
       <w:proofErr w:type="spellStart"/>
       <w:r>
@@ -5409,7 +5349,7 @@
         <w:rPr>
           <w:lang w:val="es-CL"/>
         </w:rPr>
-        <w:t xml:space="preserve"> Se documenta que la tarifa observada mezcla precio y tamaño de grupo, y que el efecto de la clase no es uniforme por sexo: en mujeres solo cae con fuerza en 3.ª clase (92.1 % → 50.0 %), mientras que en hombres ya es bajo desde la 2.ª (36.9 % → 15.7 %).</w:t>
+        <w:t xml:space="preserve"> La tarifa observada mezcla precio y tamaño de grupo, y el efecto de la clase no es uniforme por sexo: en mujeres cae con fuerza solo en 3.ª clase; en hombres, ya desde la 2.ª (Tabla 2).</w:t>
       </w:r>
     </w:p>
     <w:p>
@@ -5445,21 +5385,14 @@
         <w:rPr>
           <w:lang w:val="es-CL"/>
         </w:rPr>
-        <w:t xml:space="preserve"> Se reutilizó el </w:t>
-      </w:r>
-      <w:proofErr w:type="spellStart"/>
-      <w:r>
-        <w:rPr>
-          <w:lang w:val="es-CL"/>
-        </w:rPr>
-        <w:t>dataset</w:t>
-      </w:r>
-      <w:proofErr w:type="spellEnd"/>
-      <w:r>
-        <w:rPr>
-          <w:lang w:val="es-CL"/>
-        </w:rPr>
-        <w:t xml:space="preserve"> de las Fases 2-3 sin entrenar modelos; la interacción </w:t>
+        <w:t xml:space="preserve"> Se reprodujo sin cambios la preparación de las Fases 2-3 sin entrenar un modelo predictivo; la </w:t>
+      </w:r>
+      <w:proofErr w:type="gramStart"/>
+      <w:r>
+        <w:rPr>
+          <w:lang w:val="es-CL"/>
+        </w:rPr>
+        <w:t xml:space="preserve">interacción  </w:t>
       </w:r>
       <w:proofErr w:type="spellStart"/>
       <w:r>
@@ -5468,7 +5401,16 @@
           <w:sz w:val="19"/>
           <w:lang w:val="es-CL"/>
         </w:rPr>
-        <w:t>Sex_Pclass</w:t>
+        <w:t>Sex</w:t>
+      </w:r>
+      <w:proofErr w:type="gramEnd"/>
+      <w:r>
+        <w:rPr>
+          <w:rFonts w:ascii="Consolas" w:eastAsia="Consolas" w:hAnsi="Consolas"/>
+          <w:sz w:val="19"/>
+          <w:lang w:val="es-CL"/>
+        </w:rPr>
+        <w:t>_Pclass</w:t>
       </w:r>
       <w:proofErr w:type="spellEnd"/>
       <w:r>
@@ -5538,7 +5480,7 @@
         <w:rPr>
           <w:lang w:val="es-CL"/>
         </w:rPr>
-        <w:t xml:space="preserve"> = 0 (todos varones) se asumen tarifa legítima y se conservan (no verificable con los datos). Los criterios bastan para una selección </w:t>
+        <w:t xml:space="preserve"> = 0 (todos varones) se asumen tarifa legítima y se conservan. Los criterios bastan para una selección </w:t>
       </w:r>
       <w:r>
         <w:rPr>
@@ -5567,7 +5509,7 @@
         <w:rPr>
           <w:lang w:val="es-CL"/>
         </w:rPr>
-        <w:t>).</w:t>
+        <w:t>). La ejecución requiere conexión a internet y que las URL de origen se mantengan disponibles y sin cambios.</w:t>
       </w:r>
     </w:p>
     <w:p>
@@ -5605,35 +5547,7 @@
         <w:rPr>
           <w:lang w:val="es-CL"/>
         </w:rPr>
-        <w:t xml:space="preserve"> es 77.1 % «Desconocida» (categoría explícita, no imputada), con 27.8 % de celdas esperadas &lt; 5 y categorías casi vacías (</w:t>
-      </w:r>
-      <w:r>
-        <w:rPr>
-          <w:rFonts w:ascii="Consolas" w:eastAsia="Consolas" w:hAnsi="Consolas"/>
-          <w:sz w:val="19"/>
-          <w:lang w:val="es-CL"/>
-        </w:rPr>
-        <w:t>T</w:t>
-      </w:r>
-      <w:r>
-        <w:rPr>
-          <w:lang w:val="es-CL"/>
-        </w:rPr>
-        <w:t xml:space="preserve">, 1 caso; </w:t>
-      </w:r>
-      <w:r>
-        <w:rPr>
-          <w:rFonts w:ascii="Consolas" w:eastAsia="Consolas" w:hAnsi="Consolas"/>
-          <w:sz w:val="19"/>
-          <w:lang w:val="es-CL"/>
-        </w:rPr>
-        <w:t>G</w:t>
-      </w:r>
-      <w:r>
-        <w:rPr>
-          <w:lang w:val="es-CL"/>
-        </w:rPr>
-        <w:t xml:space="preserve">, 4); persiste redundancia parcial entre </w:t>
+        <w:t xml:space="preserve"> es 77.1 % «Desconocida», con 27.8 % de celdas esperadas &lt; 5; persiste redundancia parcial entre </w:t>
       </w:r>
       <w:proofErr w:type="spellStart"/>
       <w:r>
@@ -5703,8 +5617,13 @@
         <w:pStyle w:val="Ttulo1"/>
       </w:pPr>
       <w:r>
-        <w:t>IX. Bibliografía</w:t>
-      </w:r>
+        <w:t xml:space="preserve">IX. </w:t>
+      </w:r>
+      <w:proofErr w:type="spellStart"/>
+      <w:r>
+        <w:t>Bibliografía</w:t>
+      </w:r>
+      <w:proofErr w:type="spellEnd"/>
     </w:p>
     <w:p>
       <w:pPr>
@@ -5765,20 +5684,48 @@
         <w:rPr>
           <w:sz w:val="19"/>
         </w:rPr>
-        <w:t xml:space="preserve">Kaggle. (s. f.). </w:t>
+        <w:t xml:space="preserve">Data Science Dojo. (s. f.). </w:t>
       </w:r>
       <w:r>
         <w:rPr>
           <w:i/>
           <w:sz w:val="19"/>
         </w:rPr>
-        <w:t>Titanic - Machine learning from disaster</w:t>
+        <w:t>datasets</w:t>
       </w:r>
       <w:r>
         <w:rPr>
           <w:sz w:val="19"/>
         </w:rPr>
-        <w:t xml:space="preserve"> [Conjunto de datos]. https://www.kaggle.com/c/titanic</w:t>
+        <w:t xml:space="preserve"> [</w:t>
+      </w:r>
+      <w:proofErr w:type="spellStart"/>
+      <w:r>
+        <w:rPr>
+          <w:sz w:val="19"/>
+        </w:rPr>
+        <w:t>Repositorio</w:t>
+      </w:r>
+      <w:proofErr w:type="spellEnd"/>
+      <w:r>
+        <w:rPr>
+          <w:sz w:val="19"/>
+        </w:rPr>
+        <w:t xml:space="preserve"> de </w:t>
+      </w:r>
+      <w:proofErr w:type="spellStart"/>
+      <w:r>
+        <w:rPr>
+          <w:sz w:val="19"/>
+        </w:rPr>
+        <w:t>datos</w:t>
+      </w:r>
+      <w:proofErr w:type="spellEnd"/>
+      <w:r>
+        <w:rPr>
+          <w:sz w:val="19"/>
+        </w:rPr>
+        <w:t>]. GitHub. https://github.com/datasciencedojo/datasets</w:t>
       </w:r>
     </w:p>
     <w:p>
@@ -5790,20 +5737,34 @@
         <w:rPr>
           <w:sz w:val="19"/>
         </w:rPr>
-        <w:t xml:space="preserve">Kraskov, A., Stögbauer, H., &amp; Grassberger, P. (2004). Estimating mutual information. </w:t>
+        <w:t xml:space="preserve">Kaggle. (s. f.). </w:t>
       </w:r>
       <w:r>
         <w:rPr>
           <w:i/>
           <w:sz w:val="19"/>
         </w:rPr>
-        <w:t>Physical Review E, 69</w:t>
+        <w:t>Titanic - Machine learning from disaster</w:t>
       </w:r>
       <w:r>
         <w:rPr>
           <w:sz w:val="19"/>
         </w:rPr>
-        <w:t>(6), Artículo 066138. https://doi.org/10.1103/PhysRevE.69.066138</w:t>
+        <w:t xml:space="preserve"> [Conjunto de </w:t>
+      </w:r>
+      <w:proofErr w:type="spellStart"/>
+      <w:r>
+        <w:rPr>
+          <w:sz w:val="19"/>
+        </w:rPr>
+        <w:t>datos</w:t>
+      </w:r>
+      <w:proofErr w:type="spellEnd"/>
+      <w:r>
+        <w:rPr>
+          <w:sz w:val="19"/>
+        </w:rPr>
+        <w:t>]. https://www.kaggle.com/c/titanic</w:t>
       </w:r>
     </w:p>
     <w:p>
@@ -5815,20 +5776,48 @@
         <w:rPr>
           <w:sz w:val="19"/>
         </w:rPr>
-        <w:t xml:space="preserve">Kuhn, M., &amp; Johnson, K. (2019). </w:t>
+        <w:t xml:space="preserve">Kraskov, A., </w:t>
+      </w:r>
+      <w:proofErr w:type="spellStart"/>
+      <w:r>
+        <w:rPr>
+          <w:sz w:val="19"/>
+        </w:rPr>
+        <w:t>Stögbauer</w:t>
+      </w:r>
+      <w:proofErr w:type="spellEnd"/>
+      <w:r>
+        <w:rPr>
+          <w:sz w:val="19"/>
+        </w:rPr>
+        <w:t xml:space="preserve">, H., &amp; Grassberger, P. (2004). Estimating mutual information. </w:t>
       </w:r>
       <w:r>
         <w:rPr>
           <w:i/>
           <w:sz w:val="19"/>
         </w:rPr>
-        <w:t>Feature engineering and selection: A practical approach for predictive models</w:t>
+        <w:t>Physical Review E, 69</w:t>
       </w:r>
       <w:r>
         <w:rPr>
           <w:sz w:val="19"/>
         </w:rPr>
-        <w:t>. CRC Press.</w:t>
+        <w:t xml:space="preserve">(6), </w:t>
+      </w:r>
+      <w:proofErr w:type="spellStart"/>
+      <w:r>
+        <w:rPr>
+          <w:sz w:val="19"/>
+        </w:rPr>
+        <w:t>Artículo</w:t>
+      </w:r>
+      <w:proofErr w:type="spellEnd"/>
+      <w:r>
+        <w:rPr>
+          <w:sz w:val="19"/>
+        </w:rPr>
+        <w:t xml:space="preserve"> 066138. https://doi.org/10.1103/PhysRevE.69.066138</w:t>
       </w:r>
     </w:p>
     <w:p>
@@ -5840,20 +5829,20 @@
         <w:rPr>
           <w:sz w:val="19"/>
         </w:rPr>
-        <w:t xml:space="preserve">Mann, H. B., &amp; Whitney, D. R. (1947). On a test of whether one of two random variables is stochastically larger than the other. </w:t>
+        <w:t xml:space="preserve">Kuhn, M., &amp; Johnson, K. (2019). </w:t>
       </w:r>
       <w:r>
         <w:rPr>
           <w:i/>
           <w:sz w:val="19"/>
         </w:rPr>
-        <w:t>The Annals of Mathematical Statistics, 18</w:t>
+        <w:t>Feature engineering and selection: A practical approach for predictive models</w:t>
       </w:r>
       <w:r>
         <w:rPr>
           <w:sz w:val="19"/>
         </w:rPr>
-        <w:t>(1), 50–60. https://doi.org/10.1214/aoms/1177730491</w:t>
+        <w:t>. CRC Press.</w:t>
       </w:r>
     </w:p>
     <w:p>
@@ -5865,20 +5854,20 @@
         <w:rPr>
           <w:sz w:val="19"/>
         </w:rPr>
-        <w:t xml:space="preserve">McKinney, W. (2010). Data structures for statistical computing in Python. </w:t>
+        <w:t xml:space="preserve">Mann, H. B., &amp; Whitney, D. R. (1947). On a test of whether one of two random variables is stochastically larger than the other. </w:t>
       </w:r>
       <w:r>
         <w:rPr>
           <w:i/>
           <w:sz w:val="19"/>
         </w:rPr>
-        <w:t>Proceedings of the 9th Python in Science Conference</w:t>
+        <w:t>The Annals of Mathematical Statistics, 18</w:t>
       </w:r>
       <w:r>
         <w:rPr>
           <w:sz w:val="19"/>
         </w:rPr>
-        <w:t>, 56–61. https://doi.org/10.25080/Majora-92bf1922-00a</w:t>
+        <w:t>(1), 50–60. https://doi.org/10.1214/aoms/1177730491</w:t>
       </w:r>
     </w:p>
     <w:p>
@@ -5889,30 +5878,21 @@
       <w:r>
         <w:rPr>
           <w:sz w:val="19"/>
-          <w:lang w:val="es-CL"/>
-        </w:rPr>
-        <w:t xml:space="preserve">Paraíso, S. (2026). </w:t>
+        </w:rPr>
+        <w:t xml:space="preserve">McKinney, W. (2010). Data structures for statistical computing in Python. </w:t>
       </w:r>
       <w:r>
         <w:rPr>
           <w:i/>
           <w:sz w:val="19"/>
-          <w:lang w:val="es-CL"/>
-        </w:rPr>
-        <w:t>Resumen aplicado del libro: EDA mínimo viable</w:t>
+        </w:rPr>
+        <w:t>Proceedings of the 9th Python in Science Conference</w:t>
       </w:r>
       <w:r>
         <w:rPr>
           <w:sz w:val="19"/>
-          <w:lang w:val="es-CL"/>
-        </w:rPr>
-        <w:t xml:space="preserve"> [Apunte]. </w:t>
-      </w:r>
-      <w:r>
-        <w:rPr>
-          <w:sz w:val="19"/>
-        </w:rPr>
-        <w:t>Universidad Andrés Bello, Santiago, Chile.</w:t>
+        </w:rPr>
+        <w:t>, 56–61. https://doi.org/10.25080/Majora-92bf1922-00a</w:t>
       </w:r>
     </w:p>
     <w:p>
@@ -5923,22 +5903,30 @@
       <w:r>
         <w:rPr>
           <w:sz w:val="19"/>
-        </w:rPr>
-        <w:lastRenderedPageBreak/>
-        <w:t xml:space="preserve">Pedregosa, F., Varoquaux, G., Gramfort, A., Michel, V., Thirion, B., Grisel, O., Blondel, M., Prettenhofer, P., Weiss, R., Dubourg, V., Vanderplas, J., Passos, A., Cournapeau, D., Brucher, M., Perrot, M., &amp; Duchesnay, É. (2011). Scikit-learn: Machine learning in Python. </w:t>
+          <w:lang w:val="es-CL"/>
+        </w:rPr>
+        <w:t xml:space="preserve">Paraíso, S. (2026). </w:t>
       </w:r>
       <w:r>
         <w:rPr>
           <w:i/>
           <w:sz w:val="19"/>
-        </w:rPr>
-        <w:t>Journal of Machine Learning Research, 12</w:t>
+          <w:lang w:val="es-CL"/>
+        </w:rPr>
+        <w:t>Resumen aplicado del libro: EDA mínimo viable</w:t>
       </w:r>
       <w:r>
         <w:rPr>
           <w:sz w:val="19"/>
-        </w:rPr>
-        <w:t>, 2825–2830.</w:t>
+          <w:lang w:val="es-CL"/>
+        </w:rPr>
+        <w:t xml:space="preserve"> [Apunte]. </w:t>
+      </w:r>
+      <w:r>
+        <w:rPr>
+          <w:sz w:val="19"/>
+        </w:rPr>
+        <w:t>Universidad Andrés Bello, Santiago, Chile.</w:t>
       </w:r>
     </w:p>
     <w:p>
@@ -5950,20 +5938,76 @@
         <w:rPr>
           <w:sz w:val="19"/>
         </w:rPr>
-        <w:t xml:space="preserve">Virtanen, P., Gommers, R., Oliphant, T. E., Haberland, M., Reddy, T., Cournapeau, D., Burovski, E., Peterson, P., Weckesser, W., Bright, J., van der Walt, S. J., Brett, M., Wilson, J., Millman, K. J., Mayorov, N., Nelson, A. R. J., Jones, E., Kern, R., Larson, E., … SciPy 1.0 Contributors. (2020). SciPy 1.0: Fundamental algorithms for scientific computing in Python. </w:t>
+        <w:t xml:space="preserve">Pedregosa, F., </w:t>
+      </w:r>
+      <w:proofErr w:type="spellStart"/>
+      <w:r>
+        <w:rPr>
+          <w:sz w:val="19"/>
+        </w:rPr>
+        <w:t>Varoquaux</w:t>
+      </w:r>
+      <w:proofErr w:type="spellEnd"/>
+      <w:r>
+        <w:rPr>
+          <w:sz w:val="19"/>
+        </w:rPr>
+        <w:t xml:space="preserve">, G., </w:t>
+      </w:r>
+      <w:proofErr w:type="spellStart"/>
+      <w:r>
+        <w:rPr>
+          <w:sz w:val="19"/>
+        </w:rPr>
+        <w:t>Gramfort</w:t>
+      </w:r>
+      <w:proofErr w:type="spellEnd"/>
+      <w:r>
+        <w:rPr>
+          <w:sz w:val="19"/>
+        </w:rPr>
+        <w:t xml:space="preserve">, A., Michel, V., Thirion, B., Grisel, O., Blondel, M., </w:t>
+      </w:r>
+      <w:proofErr w:type="spellStart"/>
+      <w:r>
+        <w:rPr>
+          <w:sz w:val="19"/>
+        </w:rPr>
+        <w:t>Prettenhofer</w:t>
+      </w:r>
+      <w:proofErr w:type="spellEnd"/>
+      <w:r>
+        <w:rPr>
+          <w:sz w:val="19"/>
+        </w:rPr>
+        <w:t xml:space="preserve">, P., Weiss, R., Dubourg, V., Vanderplas, J., Passos, A., </w:t>
+      </w:r>
+      <w:proofErr w:type="spellStart"/>
+      <w:r>
+        <w:rPr>
+          <w:sz w:val="19"/>
+        </w:rPr>
+        <w:t>Cournapeau</w:t>
+      </w:r>
+      <w:proofErr w:type="spellEnd"/>
+      <w:r>
+        <w:rPr>
+          <w:sz w:val="19"/>
+        </w:rPr>
+        <w:t xml:space="preserve">, D., Brucher, M., Perrot, M., &amp; Duchesnay, É. (2011). Scikit-learn: Machine learning in Python. </w:t>
       </w:r>
       <w:r>
         <w:rPr>
           <w:i/>
           <w:sz w:val="19"/>
         </w:rPr>
-        <w:t>Nature Methods, 17</w:t>
+        <w:t>Journal of Machine Learning Research, 12</w:t>
       </w:r>
       <w:r>
         <w:rPr>
           <w:sz w:val="19"/>
         </w:rPr>
-        <w:t>, 261–272. https://doi.org/10.1038/s41592-019-0686-2</w:t>
+        <w:t>, 2825–2830.</w:t>
       </w:r>
     </w:p>
     <w:p>
@@ -5975,20 +6019,158 @@
         <w:rPr>
           <w:sz w:val="19"/>
         </w:rPr>
-        <w:t xml:space="preserve">Waskom, M. L. (2021). seaborn: Statistical data visualization. </w:t>
+        <w:t xml:space="preserve">Virtanen, P., </w:t>
+      </w:r>
+      <w:proofErr w:type="spellStart"/>
+      <w:r>
+        <w:rPr>
+          <w:sz w:val="19"/>
+        </w:rPr>
+        <w:t>Gommers</w:t>
+      </w:r>
+      <w:proofErr w:type="spellEnd"/>
+      <w:r>
+        <w:rPr>
+          <w:sz w:val="19"/>
+        </w:rPr>
+        <w:t xml:space="preserve">, R., Oliphant, T. E., Haberland, M., Reddy, T., </w:t>
+      </w:r>
+      <w:proofErr w:type="spellStart"/>
+      <w:r>
+        <w:rPr>
+          <w:sz w:val="19"/>
+        </w:rPr>
+        <w:t>Cournapeau</w:t>
+      </w:r>
+      <w:proofErr w:type="spellEnd"/>
+      <w:r>
+        <w:rPr>
+          <w:sz w:val="19"/>
+        </w:rPr>
+        <w:t xml:space="preserve">, D., Burovski, E., Peterson, P., Weckesser, W., Bright, J., van der Walt, S. J., Brett, M., Wilson, J., Millman, K. J., Mayorov, N., Nelson, A. R. J., Jones, E., Kern, R., Larson, E., … SciPy 1.0 Contributors. (2020). SciPy 1.0: Fundamental algorithms for scientific computing in Python. </w:t>
       </w:r>
       <w:r>
         <w:rPr>
           <w:i/>
           <w:sz w:val="19"/>
         </w:rPr>
-        <w:t>Journal of Open Source Software, 6</w:t>
+        <w:t>Nature Methods, 17</w:t>
       </w:r>
       <w:r>
         <w:rPr>
           <w:sz w:val="19"/>
         </w:rPr>
-        <w:t>(60), Artículo 3021. https://doi.org/10.21105/joss.03021</w:t>
+        <w:t>, 261–272. https://doi.org/10.1038/s41592-019-0686-2</w:t>
+      </w:r>
+    </w:p>
+    <w:p>
+      <w:pPr>
+        <w:spacing w:after="30" w:line="240" w:lineRule="auto"/>
+        <w:ind w:left="576" w:hanging="576"/>
+      </w:pPr>
+      <w:r>
+        <w:rPr>
+          <w:sz w:val="19"/>
+        </w:rPr>
+        <w:t xml:space="preserve">Waskom, M. L. (s. f.). </w:t>
+      </w:r>
+      <w:proofErr w:type="gramStart"/>
+      <w:r>
+        <w:rPr>
+          <w:i/>
+          <w:sz w:val="19"/>
+        </w:rPr>
+        <w:t>seaborn-data</w:t>
+      </w:r>
+      <w:proofErr w:type="gramEnd"/>
+      <w:r>
+        <w:rPr>
+          <w:sz w:val="19"/>
+        </w:rPr>
+        <w:t xml:space="preserve"> [</w:t>
+      </w:r>
+      <w:proofErr w:type="spellStart"/>
+      <w:r>
+        <w:rPr>
+          <w:sz w:val="19"/>
+        </w:rPr>
+        <w:t>Repositorio</w:t>
+      </w:r>
+      <w:proofErr w:type="spellEnd"/>
+      <w:r>
+        <w:rPr>
+          <w:sz w:val="19"/>
+        </w:rPr>
+        <w:t xml:space="preserve"> de </w:t>
+      </w:r>
+      <w:proofErr w:type="spellStart"/>
+      <w:r>
+        <w:rPr>
+          <w:sz w:val="19"/>
+        </w:rPr>
+        <w:t>datos</w:t>
+      </w:r>
+      <w:proofErr w:type="spellEnd"/>
+      <w:r>
+        <w:rPr>
+          <w:sz w:val="19"/>
+        </w:rPr>
+        <w:t>]. GitHub. https://github.com/mwaskom/seaborn-data</w:t>
+      </w:r>
+    </w:p>
+    <w:p>
+      <w:pPr>
+        <w:spacing w:after="30" w:line="240" w:lineRule="auto"/>
+        <w:ind w:left="576" w:hanging="576"/>
+      </w:pPr>
+      <w:r>
+        <w:rPr>
+          <w:sz w:val="19"/>
+        </w:rPr>
+        <w:t xml:space="preserve">Waskom, M. L. (2021). seaborn: Statistical data visualization. </w:t>
+      </w:r>
+      <w:r>
+        <w:rPr>
+          <w:i/>
+          <w:sz w:val="19"/>
+        </w:rPr>
+        <w:t xml:space="preserve">Journal of </w:t>
+      </w:r>
+      <w:proofErr w:type="gramStart"/>
+      <w:r>
+        <w:rPr>
+          <w:i/>
+          <w:sz w:val="19"/>
+        </w:rPr>
+        <w:t>Open Source</w:t>
+      </w:r>
+      <w:proofErr w:type="gramEnd"/>
+      <w:r>
+        <w:rPr>
+          <w:i/>
+          <w:sz w:val="19"/>
+        </w:rPr>
+        <w:t xml:space="preserve"> Software, 6</w:t>
+      </w:r>
+      <w:r>
+        <w:rPr>
+          <w:sz w:val="19"/>
+        </w:rPr>
+        <w:t xml:space="preserve">(60), </w:t>
+      </w:r>
+      <w:proofErr w:type="spellStart"/>
+      <w:r>
+        <w:rPr>
+          <w:sz w:val="19"/>
+        </w:rPr>
+        <w:t>Artículo</w:t>
+      </w:r>
+      <w:proofErr w:type="spellEnd"/>
+      <w:r>
+        <w:rPr>
+          <w:sz w:val="19"/>
+        </w:rPr>
+        <w:t xml:space="preserve"> 3021. https://doi.org/10.21105/joss.03021</w:t>
       </w:r>
     </w:p>
     <w:p>

</xml_diff>